<commit_message>
docs: perbarui buku panduan dan ekspor docx dengan materi dan kurikulum riil aplikasi
</commit_message>
<xml_diff>
--- a/Panduan_Penggunaan_SiagaBumi_SSK.docx
+++ b/Panduan_Penggunaan_SiagaBumi_SSK.docx
@@ -4,7 +4,7 @@
   <w:body>
     <w:p>
       <w:pPr>
-        <w:spacing w:before="1200" w:after="140"/>
+        <w:spacing w:before="1000" w:after="140"/>
         <w:jc w:val="center"/>
       </w:pPr>
       <w:r>
@@ -19,14 +19,14 @@
     </w:p>
     <w:p>
       <w:pPr>
-        <w:spacing w:before="60" w:after="200"/>
+        <w:spacing w:before="60" w:after="180"/>
         <w:jc w:val="center"/>
       </w:pPr>
       <w:r>
         <w:rPr>
           <w:rFonts w:ascii="Plus Jakarta Sans" w:hAnsi="Plus Jakarta Sans"/>
           <w:b/>
-          <w:sz w:val="60"/>
+          <w:sz w:val="56"/>
           <w:color w:val="0F172A"/>
         </w:rPr>
         <w:t>SIAGA BUMI-SSK</w:t>
@@ -40,10 +40,10 @@
       <w:r>
         <w:rPr>
           <w:rFonts w:ascii="Plus Jakarta Sans" w:hAnsi="Plus Jakarta Sans"/>
-          <w:sz w:val="28"/>
+          <w:sz w:val="26"/>
           <w:color w:val="475569"/>
         </w:rPr>
-        <w:t>Integrasi Lingkungan dan Kependudukan Dalam Program Sekolah Siaga Kependudukan</w:t>
+        <w:t>Integrasi Wawasan Lingkungan dan Dinamika Kependudukan dalam Kurikulum Sekolah Siaga Kependudukan</w:t>
       </w:r>
     </w:p>
     <w:tbl>
@@ -77,7 +77,7 @@
                 <w:color w:val="059669"/>
                 <w:sz w:val="22"/>
               </w:rPr>
-              <w:t>KONSORSIUM PENGEMBANG &amp; LEMBAGA PEMRAKARSA</w:t>
+              <w:t>KONSORSIUM PENGEMBANG &amp; LEMBAGA PEMRAKARSA SULAWESI UTARA</w:t>
             </w:r>
           </w:p>
           <w:p>
@@ -89,7 +89,7 @@
                 <w:color w:val="334155"/>
                 <w:sz w:val="21"/>
               </w:rPr>
-              <w:t xml:space="preserve">Badan Kependudukan dan Keluarga Berencana Nasional (BKKBN) Perwakilan Sulawesi Utara</w:t>
+              <w:t xml:space="preserve">Badan Kependudukan dan Keluarga Berencana Nasional (BKKBN) Perwakilan Provinsi Sulawesi Utara</w:t>
             </w:r>
           </w:p>
           <w:p>
@@ -101,7 +101,7 @@
                 <w:color w:val="334155"/>
                 <w:sz w:val="21"/>
               </w:rPr>
-              <w:t xml:space="preserve">Universitas Negeri Manado (UNIMA) — Kurikulum &amp; Pedagogi Kependudukan</w:t>
+              <w:t xml:space="preserve">Universitas Negeri Manado (UNIMA) — Kurikulum, Pedagogi &amp; Evaluasi Kependudukan</w:t>
             </w:r>
           </w:p>
           <w:p>
@@ -137,7 +137,19 @@
                 <w:color w:val="334155"/>
                 <w:sz w:val="21"/>
               </w:rPr>
-              <w:t xml:space="preserve">Domain Resmi: https://demo.gustiswandana.space | Edisi Revisi Produksi: 2026</w:t>
+              <w:t xml:space="preserve">Sekolah Pilot: SMP Negeri 1 Bitung &amp; Sekolah Rakyat Menengah Atas 44 Minahasa</w:t>
+            </w:r>
+          </w:p>
+          <w:p>
+            <w:pPr>
+              <w:spacing w:before="0" w:after="50"/>
+            </w:pPr>
+            <w:r>
+              <w:rPr>
+                <w:color w:val="334155"/>
+                <w:sz w:val="21"/>
+              </w:rPr>
+              <w:t xml:space="preserve">Domain Produksi: https://demo.gustiswandana.space | Tahun Rilis: 2026</w:t>
             </w:r>
           </w:p>
         </w:tc>
@@ -150,7 +162,7 @@
     </w:p>
     <w:p>
       <w:pPr>
-        <w:spacing w:before="800" w:after="0"/>
+        <w:spacing w:before="600" w:after="0"/>
         <w:jc w:val="center"/>
       </w:pPr>
       <w:r>
@@ -158,7 +170,7 @@
           <w:sz w:val="20"/>
           <w:color w:val="94A3B8"/>
         </w:rPr>
-        <w:t>Dokumen Resmi Manual Book Operasional LMS Sekolah Siaga Kependudukan</w:t>
+        <w:t>Dokumen Resmi Manual Book Operasional LMS Berbasis Kurikulum Riil Aplikasi</w:t>
       </w:r>
     </w:p>
     <w:p>
@@ -223,7 +235,7 @@
           <w:color w:val="334155"/>
           <w:sz w:val="22"/>
         </w:rPr>
-        <w:t xml:space="preserve">Visi kelembagaan, 3 pilar kurikulum, sekolah percontohan, dan matriks hak akses.</w:t>
+        <w:t xml:space="preserve">Visi kelembagaan BKKBN, konsorsium kampus, 3 pilar kurikulum, sekolah percontohan, dan matriks RBAC.</w:t>
       </w:r>
     </w:p>
     <w:p>
@@ -252,7 +264,7 @@
           <w:color w:val="334155"/>
           <w:sz w:val="22"/>
         </w:rPr>
-        <w:t xml:space="preserve">Registrasi mandiri, login akun, eye toggle kata sandi, dan tabel kredensial resmi.</w:t>
+        <w:t xml:space="preserve">Registrasi mandiri siswa baru, login akun, eye toggle kata sandi, dan tabel kredensial resmi.</w:t>
       </w:r>
     </w:p>
     <w:p>
@@ -281,7 +293,7 @@
           <w:color w:val="334155"/>
           <w:sz w:val="22"/>
         </w:rPr>
-        <w:t xml:space="preserve">Dasbor satu aksi utama, pemutar video YouTube bebas iklan, live tracking 90%, catatan waktu, kuis checkpoint 70%, dan sertifikat.</w:t>
+        <w:t xml:space="preserve">Bedah lengkap 3 kursus resmi di aplikasi (Mengenai BKKBN, Apa sih SSK?, PPKS), 6 video pelajaran YouTube, durasi, dan butir kuis checkpoint.</w:t>
       </w:r>
     </w:p>
     <w:p>
@@ -310,7 +322,7 @@
           <w:color w:val="334155"/>
           <w:sz w:val="22"/>
         </w:rPr>
-        <w:t xml:space="preserve">Unified Course Builder, integrasi video YouTube, modul materi, bank soal kuis, kunci jawaban &amp; pembahasan.</w:t>
+        <w:t xml:space="preserve">Dasbor satu aksi utama, pemutar video YouTube bebas iklan, live tracking 90%, catatan waktu interaktif, kuis kelulusan 70%, dan sertifikat.</w:t>
       </w:r>
     </w:p>
     <w:p>
@@ -339,7 +351,7 @@
           <w:color w:val="334155"/>
           <w:sz w:val="22"/>
         </w:rPr>
-        <w:t xml:space="preserve">Dasbor sekolah, pendaftaran satuan &amp; impor CSV masal, reset kata sandi, dan verifikasi kelulusan kelas.</w:t>
+        <w:t xml:space="preserve">Unified Course Builder, integrasi video YouTube, manajemen modul materi, bank soal kuis, kunci jawaban &amp; pembahasan.</w:t>
       </w:r>
     </w:p>
     <w:p>
@@ -368,7 +380,7 @@
           <w:color w:val="334155"/>
           <w:sz w:val="22"/>
         </w:rPr>
-        <w:t xml:space="preserve">Dasbor provinsi BKKBN, master data sekolah, kurasi visibilitas mode galeri (is_visible_to_guest), dan tiket bantuan.</w:t>
+        <w:t xml:space="preserve">Dasbor sekolah, pendaftaran satuan &amp; impor CSV masal, reset kata sandi, dan verifikasi kelulusan kelas.</w:t>
       </w:r>
     </w:p>
     <w:p>
@@ -397,7 +409,7 @@
           <w:color w:val="334155"/>
           <w:sz w:val="22"/>
         </w:rPr>
-        <w:t xml:space="preserve">Penyuluhan lapangan, peninjauan kurikulum tanpa distraksi, dan batasan hak akses view-only.</w:t>
+        <w:t xml:space="preserve">Dasbor provinsi BKKBN, master data sekolah, kurasi visibilitas mode galeri (is_visible_to_guest), dan tiket bantuan.</w:t>
       </w:r>
     </w:p>
     <w:p>
@@ -426,7 +438,7 @@
           <w:color w:val="334155"/>
           <w:sz w:val="22"/>
         </w:rPr>
-        <w:t xml:space="preserve">Tiga lapis pengamanan, nomor seri unik, pemindaian QR Code kamera ponsel, dan verifikasi publik.</w:t>
+        <w:t xml:space="preserve">Penyuluhan lapangan, peninjauan kurikulum tanpa distraksi, dan batasan hak akses view-only.</w:t>
       </w:r>
     </w:p>
     <w:p>
@@ -455,7 +467,36 @@
           <w:color w:val="334155"/>
           <w:sz w:val="22"/>
         </w:rPr>
-        <w:t xml:space="preserve">Solusi video YouTube, perbaikan salah eja nama, dan pengulangan kuis remedial.</w:t>
+        <w:t xml:space="preserve">Tiga lapis pengamanan, nomor seri unik, pemindaian QR Code kamera ponsel, dan verifikasi publik.</w:t>
+      </w:r>
+    </w:p>
+    <w:p>
+      <w:pPr>
+        <w:ind w:left="360" w:hanging="240"/>
+        <w:spacing w:before="40" w:after="80" w:line="280" w:lineRule="auto"/>
+      </w:pPr>
+      <w:r>
+        <w:rPr>
+          <w:rFonts w:ascii="Arial" w:hAnsi="Arial"/>
+          <w:color w:val="059669"/>
+          <w:sz w:val="20"/>
+        </w:rPr>
+        <w:t xml:space="preserve">•  </w:t>
+      </w:r>
+      <w:r>
+        <w:rPr>
+          <w:b/>
+          <w:color w:val="0F172A"/>
+          <w:sz w:val="22"/>
+        </w:rPr>
+        <w:t xml:space="preserve">10. </w:t>
+      </w:r>
+      <w:r>
+        <w:rPr>
+          <w:color w:val="334155"/>
+          <w:sz w:val="22"/>
+        </w:rPr>
+        <w:t xml:space="preserve">Solusi ambang tontonan 90%, pengulangan kuis remedial 70%, perbaikan ejaan nama, dan video YouTube.</w:t>
       </w:r>
     </w:p>
     <w:p>
@@ -655,9 +696,9 @@
             </wp:cNvGraphicFramePr>
             <a:graphic>
               <a:graphicData uri="http://schemas.openxmlformats.org/drawingml/2006/picture">
-                <pic:pic>
+                <pic:pic xmlns:pic="http://schemas.openxmlformats.org/drawingml/2006/picture">
                   <pic:nvPicPr>
-                    <pic:cNvPr id="1" name="Gambar 1"/>
+                    <pic:cNvPr id="1" name="Screenshot 1"/>
                     <pic:cNvPicPr/>
                   </pic:nvPicPr>
                   <pic:blipFill>
@@ -674,11 +715,6 @@
                     <a:prstGeom prst="rect">
                       <a:avLst/>
                     </a:prstGeom>
-                    <a:ln w="12700">
-                      <a:solidFill>
-                        <a:srgbClr val="CBD5E1"/>
-                      </a:solidFill>
-                    </a:ln>
                   </pic:spPr>
                 </pic:pic>
               </a:graphicData>
@@ -1519,9 +1555,9 @@
             </wp:cNvGraphicFramePr>
             <a:graphic>
               <a:graphicData uri="http://schemas.openxmlformats.org/drawingml/2006/picture">
-                <pic:pic>
+                <pic:pic xmlns:pic="http://schemas.openxmlformats.org/drawingml/2006/picture">
                   <pic:nvPicPr>
-                    <pic:cNvPr id="3" name="Gambar 3"/>
+                    <pic:cNvPr id="3" name="Screenshot 3"/>
                     <pic:cNvPicPr/>
                   </pic:nvPicPr>
                   <pic:blipFill>
@@ -1538,11 +1574,6 @@
                     <a:prstGeom prst="rect">
                       <a:avLst/>
                     </a:prstGeom>
-                    <a:ln w="12700">
-                      <a:solidFill>
-                        <a:srgbClr val="CBD5E1"/>
-                      </a:solidFill>
-                    </a:ln>
                   </pic:spPr>
                 </pic:pic>
               </a:graphicData>
@@ -1726,9 +1757,9 @@
             </wp:cNvGraphicFramePr>
             <a:graphic>
               <a:graphicData uri="http://schemas.openxmlformats.org/drawingml/2006/picture">
-                <pic:pic>
+                <pic:pic xmlns:pic="http://schemas.openxmlformats.org/drawingml/2006/picture">
                   <pic:nvPicPr>
-                    <pic:cNvPr id="2" name="Gambar 2"/>
+                    <pic:cNvPr id="2" name="Screenshot 2"/>
                     <pic:cNvPicPr/>
                   </pic:nvPicPr>
                   <pic:blipFill>
@@ -1745,11 +1776,6 @@
                     <a:prstGeom prst="rect">
                       <a:avLst/>
                     </a:prstGeom>
-                    <a:ln w="12700">
-                      <a:solidFill>
-                        <a:srgbClr val="CBD5E1"/>
-                      </a:solidFill>
-                    </a:ln>
                   </pic:spPr>
                 </pic:pic>
               </a:graphicData>
@@ -2151,7 +2177,7 @@
                 <w:color w:val="334155"/>
                 <w:sz w:val="20"/>
               </w:rPr>
-              <w:t>guru.bitung@sekolah.sch.id</w:t>
+              <w:t>guru.minahasa@siagabumi.id</w:t>
             </w:r>
           </w:p>
         </w:tc>
@@ -2187,7 +2213,7 @@
                 <w:color w:val="334155"/>
                 <w:sz w:val="20"/>
               </w:rPr>
-              <w:t>SMP Negeri 1 Bitung</w:t>
+              <w:t>SRMA 44 Minahasa (Pengajar SSK)</w:t>
             </w:r>
           </w:p>
         </w:tc>
@@ -2207,7 +2233,7 @@
                 <w:color w:val="334155"/>
                 <w:sz w:val="20"/>
               </w:rPr>
-              <w:t>Siswa Pembelajar</w:t>
+              <w:t>Guru / Pendidik (2)</w:t>
             </w:r>
           </w:p>
         </w:tc>
@@ -2225,7 +2251,7 @@
                 <w:color w:val="334155"/>
                 <w:sz w:val="20"/>
               </w:rPr>
-              <w:t>student@edutube.org</w:t>
+              <w:t>guru.bitung@sekolah.sch.id</w:t>
             </w:r>
           </w:p>
         </w:tc>
@@ -2261,7 +2287,7 @@
                 <w:color w:val="334155"/>
                 <w:sz w:val="20"/>
               </w:rPr>
-              <w:t>SMP Negeri 1 Bitung (Aktif)</w:t>
+              <w:t>SMP Negeri 1 Bitung (Pengajar PPKS)</w:t>
             </w:r>
           </w:p>
         </w:tc>
@@ -2281,7 +2307,7 @@
                 <w:color w:val="334155"/>
                 <w:sz w:val="20"/>
               </w:rPr>
-              <w:t>Siswa Pembelajar (2)</w:t>
+              <w:t>Siswa Pembelajar</w:t>
             </w:r>
           </w:p>
         </w:tc>
@@ -2299,7 +2325,7 @@
                 <w:color w:val="334155"/>
                 <w:sz w:val="20"/>
               </w:rPr>
-              <w:t>alex@student.edutube.org</w:t>
+              <w:t>student@edutube.org</w:t>
             </w:r>
           </w:p>
         </w:tc>
@@ -2335,7 +2361,7 @@
                 <w:color w:val="334155"/>
                 <w:sz w:val="20"/>
               </w:rPr>
-              <w:t>Siswa Mandiri</w:t>
+              <w:t>SMP Negeri 1 Bitung (Aktif)</w:t>
             </w:r>
           </w:p>
         </w:tc>
@@ -2355,7 +2381,7 @@
                 <w:color w:val="334155"/>
                 <w:sz w:val="20"/>
               </w:rPr>
-              <w:t>Penyuluh / Tamu</w:t>
+              <w:t>Siswa Pembelajar (2)</w:t>
             </w:r>
           </w:p>
         </w:tc>
@@ -2373,7 +2399,7 @@
                 <w:color w:val="334155"/>
                 <w:sz w:val="20"/>
               </w:rPr>
-              <w:t>guest@edutube.org</w:t>
+              <w:t>budi@edutube.org</w:t>
             </w:r>
           </w:p>
         </w:tc>
@@ -2399,6 +2425,80 @@
           <w:tcPr>
             <w:tcW w:w="2860" w:type="dxa"/>
             <w:shd w:val="clear" w:color="auto" w:fill="FFFFFF"/>
+          </w:tcPr>
+          <w:p>
+            <w:pPr>
+              <w:spacing w:before="40" w:after="40"/>
+            </w:pPr>
+            <w:r>
+              <w:rPr>
+                <w:color w:val="334155"/>
+                <w:sz w:val="20"/>
+              </w:rPr>
+              <w:t>SMP Negeri 1 Bitung (Lulus Kursus BKKBN)</w:t>
+            </w:r>
+          </w:p>
+        </w:tc>
+      </w:tr>
+      <w:tr>
+        <w:tc>
+          <w:tcPr>
+            <w:tcW w:w="2100" w:type="dxa"/>
+            <w:shd w:val="clear" w:color="auto" w:fill="F8FAFC"/>
+          </w:tcPr>
+          <w:p>
+            <w:pPr>
+              <w:spacing w:before="40" w:after="40"/>
+            </w:pPr>
+            <w:r>
+              <w:rPr>
+                <w:color w:val="334155"/>
+                <w:sz w:val="20"/>
+              </w:rPr>
+              <w:t>Penyuluh / Tamu</w:t>
+            </w:r>
+          </w:p>
+        </w:tc>
+        <w:tc>
+          <w:tcPr>
+            <w:tcW w:w="2900" w:type="dxa"/>
+            <w:shd w:val="clear" w:color="auto" w:fill="F8FAFC"/>
+          </w:tcPr>
+          <w:p>
+            <w:pPr>
+              <w:spacing w:before="40" w:after="40"/>
+            </w:pPr>
+            <w:r>
+              <w:rPr>
+                <w:color w:val="334155"/>
+                <w:sz w:val="20"/>
+              </w:rPr>
+              <w:t>guest@edutube.org</w:t>
+            </w:r>
+          </w:p>
+        </w:tc>
+        <w:tc>
+          <w:tcPr>
+            <w:tcW w:w="1500" w:type="dxa"/>
+            <w:shd w:val="clear" w:color="auto" w:fill="F8FAFC"/>
+          </w:tcPr>
+          <w:p>
+            <w:pPr>
+              <w:spacing w:before="40" w:after="40"/>
+            </w:pPr>
+            <w:r>
+              <w:rPr>
+                <w:color w:val="334155"/>
+                <w:sz w:val="20"/>
+              </w:rPr>
+              <w:t>password</w:t>
+            </w:r>
+          </w:p>
+        </w:tc>
+        <w:tc>
+          <w:tcPr>
+            <w:tcW w:w="2860" w:type="dxa"/>
+            <w:shd w:val="clear" w:color="auto" w:fill="F8FAFC"/>
           </w:tcPr>
           <w:p>
             <w:pPr>
@@ -2441,7 +2541,7 @@
           <w:sz w:val="34"/>
           <w:color w:val="065F46"/>
         </w:rPr>
-        <w:t>Bab 3: Panduan Siswa Pembelajar (Siswa)</w:t>
+        <w:t>Bab 3: Kurikulum &amp; Silabus Materi Riil Aplikasi</w:t>
       </w:r>
     </w:p>
     <w:p>
@@ -2453,8 +2553,478 @@
           <w:color w:val="334155"/>
           <w:sz w:val="22"/>
         </w:rPr>
-        <w:t xml:space="preserve">Antarmuka siswa dirancang dengan pendekatan humanis, bebas dari elemen visual yang membingungkan, dan berfokus pada pengalaman belajar yang menyenangkan.</w:t>
-      </w:r>
+        <w:t xml:space="preserve">Platform SIAGA BUMI-SSK saat ini mengoperasikan 3 kursus resmi dengan 6 pelajaran video HD YouTube dan bank soal evaluasi pemahaman yang terhubung langsung ke basis data produksi:</w:t>
+      </w:r>
+    </w:p>
+    <w:tbl>
+      <w:tblPr>
+        <w:tblW w:w="9360" w:type="dxa"/>
+        <w:tblBorders>
+          <w:top w:val="single" w:sz="6" w:space="0" w:color="CBD5E1"/>
+          <w:left w:val="single" w:sz="6" w:space="0" w:color="CBD5E1"/>
+          <w:bottom w:val="single" w:sz="6" w:space="0" w:color="CBD5E1"/>
+          <w:right w:val="single" w:sz="6" w:space="0" w:color="CBD5E1"/>
+          <w:insideH w:val="single" w:sz="4" w:space="0" w:color="E2E8F0"/>
+          <w:insideV w:val="single" w:sz="4" w:space="0" w:color="E2E8F0"/>
+        </w:tblBorders>
+        <w:tblCellMar>
+          <w:top w:w="120" w:type="dxa"/>
+          <w:left w:w="140" w:type="dxa"/>
+          <w:bottom w:w="120" w:type="dxa"/>
+          <w:right w:w="140" w:type="dxa"/>
+        </w:tblCellMar>
+      </w:tblPr>
+      <w:tr>
+        <w:tc>
+          <w:tcPr>
+            <w:tcW w:w="2300" w:type="dxa"/>
+            <w:shd w:val="clear" w:color="auto" w:fill="ECFDF5"/>
+          </w:tcPr>
+          <w:p>
+            <w:pPr>
+              <w:spacing w:before="40" w:after="40"/>
+            </w:pPr>
+            <w:r>
+              <w:rPr>
+                <w:b/>
+                <w:color w:val="065F46"/>
+                <w:sz w:val="19"/>
+              </w:rPr>
+              <w:t>Judul Kursus Resmi</w:t>
+            </w:r>
+          </w:p>
+        </w:tc>
+        <w:tc>
+          <w:tcPr>
+            <w:tcW w:w="1800" w:type="dxa"/>
+            <w:shd w:val="clear" w:color="auto" w:fill="ECFDF5"/>
+          </w:tcPr>
+          <w:p>
+            <w:pPr>
+              <w:spacing w:before="40" w:after="40"/>
+            </w:pPr>
+            <w:r>
+              <w:rPr>
+                <w:b/>
+                <w:color w:val="065F46"/>
+                <w:sz w:val="19"/>
+              </w:rPr>
+              <w:t>Pilar Kurikulum</w:t>
+            </w:r>
+          </w:p>
+        </w:tc>
+        <w:tc>
+          <w:tcPr>
+            <w:tcW w:w="1700" w:type="dxa"/>
+            <w:shd w:val="clear" w:color="auto" w:fill="ECFDF5"/>
+          </w:tcPr>
+          <w:p>
+            <w:pPr>
+              <w:spacing w:before="40" w:after="40"/>
+            </w:pPr>
+            <w:r>
+              <w:rPr>
+                <w:b/>
+                <w:color w:val="065F46"/>
+                <w:sz w:val="19"/>
+              </w:rPr>
+              <w:t>Satuan Sekolah Pengampu</w:t>
+            </w:r>
+          </w:p>
+        </w:tc>
+        <w:tc>
+          <w:tcPr>
+            <w:tcW w:w="1600" w:type="dxa"/>
+            <w:shd w:val="clear" w:color="auto" w:fill="ECFDF5"/>
+          </w:tcPr>
+          <w:p>
+            <w:pPr>
+              <w:spacing w:before="40" w:after="40"/>
+            </w:pPr>
+            <w:r>
+              <w:rPr>
+                <w:b/>
+                <w:color w:val="065F46"/>
+                <w:sz w:val="19"/>
+              </w:rPr>
+              <w:t>Guru Pengampu / Instruktur</w:t>
+            </w:r>
+          </w:p>
+        </w:tc>
+        <w:tc>
+          <w:tcPr>
+            <w:tcW w:w="1100" w:type="dxa"/>
+            <w:shd w:val="clear" w:color="auto" w:fill="ECFDF5"/>
+          </w:tcPr>
+          <w:p>
+            <w:pPr>
+              <w:spacing w:before="40" w:after="40"/>
+            </w:pPr>
+            <w:r>
+              <w:rPr>
+                <w:b/>
+                <w:color w:val="065F46"/>
+                <w:sz w:val="19"/>
+              </w:rPr>
+              <w:t>Total Modul &amp; Durasi</w:t>
+            </w:r>
+          </w:p>
+        </w:tc>
+        <w:tc>
+          <w:tcPr>
+            <w:tcW w:w="860" w:type="dxa"/>
+            <w:shd w:val="clear" w:color="auto" w:fill="ECFDF5"/>
+          </w:tcPr>
+          <w:p>
+            <w:pPr>
+              <w:spacing w:before="40" w:after="40"/>
+            </w:pPr>
+            <w:r>
+              <w:rPr>
+                <w:b/>
+                <w:color w:val="065F46"/>
+                <w:sz w:val="19"/>
+              </w:rPr>
+              <w:t>Akses Galeri</w:t>
+            </w:r>
+          </w:p>
+        </w:tc>
+      </w:tr>
+      <w:tr>
+        <w:tc>
+          <w:tcPr>
+            <w:tcW w:w="2300" w:type="dxa"/>
+            <w:shd w:val="clear" w:color="auto" w:fill="FFFFFF"/>
+          </w:tcPr>
+          <w:p>
+            <w:pPr>
+              <w:spacing w:before="40" w:after="40"/>
+            </w:pPr>
+            <w:r>
+              <w:rPr>
+                <w:color w:val="334155"/>
+                <w:sz w:val="19"/>
+              </w:rPr>
+              <w:t>Mengenai BKKBN</w:t>
+            </w:r>
+          </w:p>
+        </w:tc>
+        <w:tc>
+          <w:tcPr>
+            <w:tcW w:w="1800" w:type="dxa"/>
+            <w:shd w:val="clear" w:color="auto" w:fill="FFFFFF"/>
+          </w:tcPr>
+          <w:p>
+            <w:pPr>
+              <w:spacing w:before="40" w:after="40"/>
+            </w:pPr>
+            <w:r>
+              <w:rPr>
+                <w:color w:val="334155"/>
+                <w:sz w:val="19"/>
+              </w:rPr>
+              <w:t>Materi Umum Kependudukan</w:t>
+            </w:r>
+          </w:p>
+        </w:tc>
+        <w:tc>
+          <w:tcPr>
+            <w:tcW w:w="1700" w:type="dxa"/>
+            <w:shd w:val="clear" w:color="auto" w:fill="FFFFFF"/>
+          </w:tcPr>
+          <w:p>
+            <w:pPr>
+              <w:spacing w:before="40" w:after="40"/>
+            </w:pPr>
+            <w:r>
+              <w:rPr>
+                <w:color w:val="334155"/>
+                <w:sz w:val="19"/>
+              </w:rPr>
+              <w:t>SMP Negeri 1 Bitung</w:t>
+            </w:r>
+          </w:p>
+        </w:tc>
+        <w:tc>
+          <w:tcPr>
+            <w:tcW w:w="1600" w:type="dxa"/>
+            <w:shd w:val="clear" w:color="auto" w:fill="FFFFFF"/>
+          </w:tcPr>
+          <w:p>
+            <w:pPr>
+              <w:spacing w:before="40" w:after="40"/>
+            </w:pPr>
+            <w:r>
+              <w:rPr>
+                <w:color w:val="334155"/>
+                <w:sz w:val="19"/>
+              </w:rPr>
+              <w:t>Drs. Ronald Lumempouw</w:t>
+            </w:r>
+          </w:p>
+        </w:tc>
+        <w:tc>
+          <w:tcPr>
+            <w:tcW w:w="1100" w:type="dxa"/>
+            <w:shd w:val="clear" w:color="auto" w:fill="FFFFFF"/>
+          </w:tcPr>
+          <w:p>
+            <w:pPr>
+              <w:spacing w:before="40" w:after="40"/>
+            </w:pPr>
+            <w:r>
+              <w:rPr>
+                <w:color w:val="334155"/>
+                <w:sz w:val="19"/>
+              </w:rPr>
+              <w:t>2 Video (20:00)</w:t>
+            </w:r>
+          </w:p>
+        </w:tc>
+        <w:tc>
+          <w:tcPr>
+            <w:tcW w:w="860" w:type="dxa"/>
+            <w:shd w:val="clear" w:color="auto" w:fill="FFFFFF"/>
+          </w:tcPr>
+          <w:p>
+            <w:pPr>
+              <w:spacing w:before="40" w:after="40"/>
+            </w:pPr>
+            <w:r>
+              <w:rPr>
+                <w:color w:val="334155"/>
+                <w:sz w:val="19"/>
+              </w:rPr>
+              <w:t>Tampil Publik</w:t>
+            </w:r>
+          </w:p>
+        </w:tc>
+      </w:tr>
+      <w:tr>
+        <w:tc>
+          <w:tcPr>
+            <w:tcW w:w="2300" w:type="dxa"/>
+            <w:shd w:val="clear" w:color="auto" w:fill="F8FAFC"/>
+          </w:tcPr>
+          <w:p>
+            <w:pPr>
+              <w:spacing w:before="40" w:after="40"/>
+            </w:pPr>
+            <w:r>
+              <w:rPr>
+                <w:color w:val="334155"/>
+                <w:sz w:val="19"/>
+              </w:rPr>
+              <w:t>Apa sih SSK?</w:t>
+            </w:r>
+          </w:p>
+        </w:tc>
+        <w:tc>
+          <w:tcPr>
+            <w:tcW w:w="1800" w:type="dxa"/>
+            <w:shd w:val="clear" w:color="auto" w:fill="F8FAFC"/>
+          </w:tcPr>
+          <w:p>
+            <w:pPr>
+              <w:spacing w:before="40" w:after="40"/>
+            </w:pPr>
+            <w:r>
+              <w:rPr>
+                <w:color w:val="334155"/>
+                <w:sz w:val="19"/>
+              </w:rPr>
+              <w:t>Materi Umum Lingkungan</w:t>
+            </w:r>
+          </w:p>
+        </w:tc>
+        <w:tc>
+          <w:tcPr>
+            <w:tcW w:w="1700" w:type="dxa"/>
+            <w:shd w:val="clear" w:color="auto" w:fill="F8FAFC"/>
+          </w:tcPr>
+          <w:p>
+            <w:pPr>
+              <w:spacing w:before="40" w:after="40"/>
+            </w:pPr>
+            <w:r>
+              <w:rPr>
+                <w:color w:val="334155"/>
+                <w:sz w:val="19"/>
+              </w:rPr>
+              <w:t>SRMA 44 Minahasa</w:t>
+            </w:r>
+          </w:p>
+        </w:tc>
+        <w:tc>
+          <w:tcPr>
+            <w:tcW w:w="1600" w:type="dxa"/>
+            <w:shd w:val="clear" w:color="auto" w:fill="F8FAFC"/>
+          </w:tcPr>
+          <w:p>
+            <w:pPr>
+              <w:spacing w:before="40" w:after="40"/>
+            </w:pPr>
+            <w:r>
+              <w:rPr>
+                <w:color w:val="334155"/>
+                <w:sz w:val="19"/>
+              </w:rPr>
+              <w:t>Ibu Martha Runtuwene, S.Pd</w:t>
+            </w:r>
+          </w:p>
+        </w:tc>
+        <w:tc>
+          <w:tcPr>
+            <w:tcW w:w="1100" w:type="dxa"/>
+            <w:shd w:val="clear" w:color="auto" w:fill="F8FAFC"/>
+          </w:tcPr>
+          <w:p>
+            <w:pPr>
+              <w:spacing w:before="40" w:after="40"/>
+            </w:pPr>
+            <w:r>
+              <w:rPr>
+                <w:color w:val="334155"/>
+                <w:sz w:val="19"/>
+              </w:rPr>
+              <w:t>2 Video (20:00)</w:t>
+            </w:r>
+          </w:p>
+        </w:tc>
+        <w:tc>
+          <w:tcPr>
+            <w:tcW w:w="860" w:type="dxa"/>
+            <w:shd w:val="clear" w:color="auto" w:fill="F8FAFC"/>
+          </w:tcPr>
+          <w:p>
+            <w:pPr>
+              <w:spacing w:before="40" w:after="40"/>
+            </w:pPr>
+            <w:r>
+              <w:rPr>
+                <w:color w:val="334155"/>
+                <w:sz w:val="19"/>
+              </w:rPr>
+              <w:t>Tertutup Siswa</w:t>
+            </w:r>
+          </w:p>
+        </w:tc>
+      </w:tr>
+      <w:tr>
+        <w:tc>
+          <w:tcPr>
+            <w:tcW w:w="2300" w:type="dxa"/>
+            <w:shd w:val="clear" w:color="auto" w:fill="FFFFFF"/>
+          </w:tcPr>
+          <w:p>
+            <w:pPr>
+              <w:spacing w:before="40" w:after="40"/>
+            </w:pPr>
+            <w:r>
+              <w:rPr>
+                <w:color w:val="334155"/>
+                <w:sz w:val="19"/>
+              </w:rPr>
+              <w:t>Pencegahan &amp; Penanganan Kekerasan Seksual (PPKS)</w:t>
+            </w:r>
+          </w:p>
+        </w:tc>
+        <w:tc>
+          <w:tcPr>
+            <w:tcW w:w="1800" w:type="dxa"/>
+            <w:shd w:val="clear" w:color="auto" w:fill="FFFFFF"/>
+          </w:tcPr>
+          <w:p>
+            <w:pPr>
+              <w:spacing w:before="40" w:after="40"/>
+            </w:pPr>
+            <w:r>
+              <w:rPr>
+                <w:color w:val="334155"/>
+                <w:sz w:val="19"/>
+              </w:rPr>
+              <w:t>Kekerasan Sexual</w:t>
+            </w:r>
+          </w:p>
+        </w:tc>
+        <w:tc>
+          <w:tcPr>
+            <w:tcW w:w="1700" w:type="dxa"/>
+            <w:shd w:val="clear" w:color="auto" w:fill="FFFFFF"/>
+          </w:tcPr>
+          <w:p>
+            <w:pPr>
+              <w:spacing w:before="40" w:after="40"/>
+            </w:pPr>
+            <w:r>
+              <w:rPr>
+                <w:color w:val="334155"/>
+                <w:sz w:val="19"/>
+              </w:rPr>
+              <w:t>SMP Negeri 1 Bitung</w:t>
+            </w:r>
+          </w:p>
+        </w:tc>
+        <w:tc>
+          <w:tcPr>
+            <w:tcW w:w="1600" w:type="dxa"/>
+            <w:shd w:val="clear" w:color="auto" w:fill="FFFFFF"/>
+          </w:tcPr>
+          <w:p>
+            <w:pPr>
+              <w:spacing w:before="40" w:after="40"/>
+            </w:pPr>
+            <w:r>
+              <w:rPr>
+                <w:color w:val="334155"/>
+                <w:sz w:val="19"/>
+              </w:rPr>
+              <w:t>Dra. Maria Sondakh, M.Si</w:t>
+            </w:r>
+          </w:p>
+        </w:tc>
+        <w:tc>
+          <w:tcPr>
+            <w:tcW w:w="1100" w:type="dxa"/>
+            <w:shd w:val="clear" w:color="auto" w:fill="FFFFFF"/>
+          </w:tcPr>
+          <w:p>
+            <w:pPr>
+              <w:spacing w:before="40" w:after="40"/>
+            </w:pPr>
+            <w:r>
+              <w:rPr>
+                <w:color w:val="334155"/>
+                <w:sz w:val="19"/>
+              </w:rPr>
+              <w:t>2 Video (19:00)</w:t>
+            </w:r>
+          </w:p>
+        </w:tc>
+        <w:tc>
+          <w:tcPr>
+            <w:tcW w:w="860" w:type="dxa"/>
+            <w:shd w:val="clear" w:color="auto" w:fill="FFFFFF"/>
+          </w:tcPr>
+          <w:p>
+            <w:pPr>
+              <w:spacing w:before="40" w:after="40"/>
+            </w:pPr>
+            <w:r>
+              <w:rPr>
+                <w:color w:val="334155"/>
+                <w:sz w:val="19"/>
+              </w:rPr>
+              <w:t>Tampil Publik</w:t>
+            </w:r>
+          </w:p>
+        </w:tc>
+      </w:tr>
+    </w:tbl>
+    <w:p>
+      <w:pPr>
+        <w:spacing w:before="0" w:after="160"/>
+      </w:pPr>
     </w:p>
     <w:p>
       <w:pPr>
@@ -2469,7 +3039,1780 @@
           <w:sz w:val="28"/>
           <w:color w:val="1E3A8A"/>
         </w:rPr>
-        <w:t>3.1 Dasbor Pembelajaran &amp; Satu Aksi Utama</w:t>
+        <w:t>3.1 Kursus 1: Mengenai BKKBN (Pilar Kependudukan)</w:t>
+      </w:r>
+    </w:p>
+    <w:tbl>
+      <w:tblPr>
+        <w:tblW w:w="9360" w:type="dxa"/>
+        <w:tblBorders>
+          <w:top w:val="none"/>
+          <w:left w:val="single" w:sz="28" w:space="0" w:color="4F46E5"/>
+          <w:bottom w:val="none"/>
+          <w:right w:val="none"/>
+        </w:tblBorders>
+        <w:tblCellMar>
+          <w:top w:w="160" w:type="dxa"/>
+          <w:left w:w="260" w:type="dxa"/>
+          <w:bottom w:w="160" w:type="dxa"/>
+          <w:right w:w="260" w:type="dxa"/>
+        </w:tblCellMar>
+      </w:tblPr>
+      <w:tr>
+        <w:tc>
+          <w:tcPr>
+            <w:shd w:val="clear" w:color="auto" w:fill="EEF2FF"/>
+          </w:tcPr>
+          <w:p>
+            <w:pPr>
+              <w:spacing w:before="60" w:after="60"/>
+            </w:pPr>
+            <w:r>
+              <w:rPr>
+                <w:b/>
+                <w:color w:val="4F46E5"/>
+                <w:sz w:val="22"/>
+              </w:rPr>
+              <w:t>METADATA KURSUS RESMI: MENGENAI BKKBN</w:t>
+            </w:r>
+          </w:p>
+          <w:p>
+            <w:pPr>
+              <w:spacing w:before="0" w:after="50"/>
+            </w:pPr>
+            <w:r>
+              <w:rPr>
+                <w:color w:val="334155"/>
+                <w:sz w:val="21"/>
+              </w:rPr>
+              <w:t xml:space="preserve">Kategori: Materi Umum Kependudukan (GenRe &amp; BKKBN)</w:t>
+            </w:r>
+          </w:p>
+          <w:p>
+            <w:pPr>
+              <w:spacing w:before="0" w:after="50"/>
+            </w:pPr>
+            <w:r>
+              <w:rPr>
+                <w:color w:val="334155"/>
+                <w:sz w:val="21"/>
+              </w:rPr>
+              <w:t xml:space="preserve">Sekolah Pengampu: SMP Negeri 1 Bitung</w:t>
+            </w:r>
+          </w:p>
+          <w:p>
+            <w:pPr>
+              <w:spacing w:before="0" w:after="50"/>
+            </w:pPr>
+            <w:r>
+              <w:rPr>
+                <w:color w:val="334155"/>
+                <w:sz w:val="21"/>
+              </w:rPr>
+              <w:t xml:space="preserve">Instruktur Pengampu: Drs. Ronald Lumempouw</w:t>
+            </w:r>
+          </w:p>
+          <w:p>
+            <w:pPr>
+              <w:spacing w:before="0" w:after="50"/>
+            </w:pPr>
+            <w:r>
+              <w:rPr>
+                <w:color w:val="334155"/>
+                <w:sz w:val="21"/>
+              </w:rPr>
+              <w:t xml:space="preserve">Tingkat: Pemula (SMP/SMA) | Slug: mengenai-bkkbn-peran-kependudukan</w:t>
+            </w:r>
+          </w:p>
+          <w:p>
+            <w:pPr>
+              <w:spacing w:before="0" w:after="50"/>
+            </w:pPr>
+            <w:r>
+              <w:rPr>
+                <w:color w:val="334155"/>
+                <w:sz w:val="21"/>
+              </w:rPr>
+              <w:t xml:space="preserve">Akses Mode Galeri / Tamu: Ya (is_visible_to_guest = true)</w:t>
+            </w:r>
+          </w:p>
+          <w:p>
+            <w:pPr>
+              <w:spacing w:before="0" w:after="50"/>
+            </w:pPr>
+            <w:r>
+              <w:rPr>
+                <w:color w:val="334155"/>
+                <w:sz w:val="21"/>
+              </w:rPr>
+              <w:t xml:space="preserve">Deskripsi: Mengenal sejarah kelembagaan, visi transformasi, dan fungsi strategis BKKBN dalam memimpin program Bangga Kencana serta percepatan penurunan stunting menuju Indonesia Emas 2045.</w:t>
+            </w:r>
+          </w:p>
+        </w:tc>
+      </w:tr>
+    </w:tbl>
+    <w:p>
+      <w:pPr>
+        <w:spacing w:before="0" w:after="120"/>
+      </w:pPr>
+    </w:p>
+    <w:tbl>
+      <w:tblPr>
+        <w:tblW w:w="9360" w:type="dxa"/>
+        <w:tblBorders>
+          <w:top w:val="single" w:sz="6" w:space="0" w:color="CBD5E1"/>
+          <w:left w:val="single" w:sz="6" w:space="0" w:color="CBD5E1"/>
+          <w:bottom w:val="single" w:sz="6" w:space="0" w:color="CBD5E1"/>
+          <w:right w:val="single" w:sz="6" w:space="0" w:color="CBD5E1"/>
+          <w:insideH w:val="single" w:sz="4" w:space="0" w:color="E2E8F0"/>
+          <w:insideV w:val="single" w:sz="4" w:space="0" w:color="E2E8F0"/>
+        </w:tblBorders>
+        <w:tblCellMar>
+          <w:top w:w="120" w:type="dxa"/>
+          <w:left w:w="140" w:type="dxa"/>
+          <w:bottom w:w="120" w:type="dxa"/>
+          <w:right w:w="140" w:type="dxa"/>
+        </w:tblCellMar>
+      </w:tblPr>
+      <w:tr>
+        <w:tc>
+          <w:tcPr>
+            <w:tcW w:w="700" w:type="dxa"/>
+            <w:shd w:val="clear" w:color="auto" w:fill="EEF2FF"/>
+          </w:tcPr>
+          <w:p>
+            <w:pPr>
+              <w:spacing w:before="40" w:after="40"/>
+            </w:pPr>
+            <w:r>
+              <w:rPr>
+                <w:b/>
+                <w:sz w:val="19"/>
+                <w:color w:val="312E81"/>
+              </w:rPr>
+              <w:t>No</w:t>
+            </w:r>
+          </w:p>
+        </w:tc>
+        <w:tc>
+          <w:tcPr>
+            <w:tcW w:w="2800" w:type="dxa"/>
+            <w:shd w:val="clear" w:color="auto" w:fill="EEF2FF"/>
+          </w:tcPr>
+          <w:p>
+            <w:pPr>
+              <w:spacing w:before="40" w:after="40"/>
+            </w:pPr>
+            <w:r>
+              <w:rPr>
+                <w:b/>
+                <w:sz w:val="19"/>
+                <w:color w:val="312E81"/>
+              </w:rPr>
+              <w:t>Judul Pelajaran Video</w:t>
+            </w:r>
+          </w:p>
+        </w:tc>
+        <w:tc>
+          <w:tcPr>
+            <w:tcW w:w="1100" w:type="dxa"/>
+            <w:shd w:val="clear" w:color="auto" w:fill="EEF2FF"/>
+          </w:tcPr>
+          <w:p>
+            <w:pPr>
+              <w:spacing w:before="40" w:after="40"/>
+            </w:pPr>
+            <w:r>
+              <w:rPr>
+                <w:b/>
+                <w:sz w:val="19"/>
+                <w:color w:val="312E81"/>
+              </w:rPr>
+              <w:t>Durasi</w:t>
+            </w:r>
+          </w:p>
+        </w:tc>
+        <w:tc>
+          <w:tcPr>
+            <w:tcW w:w="1400" w:type="dxa"/>
+            <w:shd w:val="clear" w:color="auto" w:fill="EEF2FF"/>
+          </w:tcPr>
+          <w:p>
+            <w:pPr>
+              <w:spacing w:before="40" w:after="40"/>
+            </w:pPr>
+            <w:r>
+              <w:rPr>
+                <w:b/>
+                <w:sz w:val="19"/>
+                <w:color w:val="312E81"/>
+              </w:rPr>
+              <w:t>ID YouTube</w:t>
+            </w:r>
+          </w:p>
+        </w:tc>
+        <w:tc>
+          <w:tcPr>
+            <w:tcW w:w="3360" w:type="dxa"/>
+            <w:shd w:val="clear" w:color="auto" w:fill="EEF2FF"/>
+          </w:tcPr>
+          <w:p>
+            <w:pPr>
+              <w:spacing w:before="40" w:after="40"/>
+            </w:pPr>
+            <w:r>
+              <w:rPr>
+                <w:b/>
+                <w:sz w:val="19"/>
+                <w:color w:val="312E81"/>
+              </w:rPr>
+              <w:t>Ringkasan Pembelajaran</w:t>
+            </w:r>
+          </w:p>
+        </w:tc>
+      </w:tr>
+      <w:tr>
+        <w:tc>
+          <w:tcPr>
+            <w:tcW w:w="700" w:type="dxa"/>
+            <w:shd w:val="clear" w:color="auto" w:fill="FFFFFF"/>
+          </w:tcPr>
+          <w:p>
+            <w:pPr>
+              <w:spacing w:before="40" w:after="40"/>
+            </w:pPr>
+            <w:r>
+              <w:rPr>
+                <w:sz w:val="19"/>
+                <w:color w:val="334155"/>
+              </w:rPr>
+              <w:t>1</w:t>
+            </w:r>
+          </w:p>
+        </w:tc>
+        <w:tc>
+          <w:tcPr>
+            <w:tcW w:w="2800" w:type="dxa"/>
+            <w:shd w:val="clear" w:color="auto" w:fill="FFFFFF"/>
+          </w:tcPr>
+          <w:p>
+            <w:pPr>
+              <w:spacing w:before="40" w:after="40"/>
+            </w:pPr>
+            <w:r>
+              <w:rPr>
+                <w:b/>
+                <w:sz w:val="19"/>
+                <w:color w:val="0F172A"/>
+              </w:rPr>
+              <w:t>1.1: Makna &amp; Filosofi Kelembagaan BKKBN</w:t>
+            </w:r>
+          </w:p>
+        </w:tc>
+        <w:tc>
+          <w:tcPr>
+            <w:tcW w:w="1100" w:type="dxa"/>
+            <w:shd w:val="clear" w:color="auto" w:fill="FFFFFF"/>
+          </w:tcPr>
+          <w:p>
+            <w:pPr>
+              <w:spacing w:before="40" w:after="40"/>
+            </w:pPr>
+            <w:r>
+              <w:rPr>
+                <w:sz w:val="19"/>
+                <w:color w:val="059669"/>
+                <w:rFonts w:ascii="Courier New" w:hAnsi="Courier New"/>
+              </w:rPr>
+              <w:t>08:00</w:t>
+            </w:r>
+          </w:p>
+        </w:tc>
+        <w:tc>
+          <w:tcPr>
+            <w:tcW w:w="1400" w:type="dxa"/>
+            <w:shd w:val="clear" w:color="auto" w:fill="FFFFFF"/>
+          </w:tcPr>
+          <w:p>
+            <w:pPr>
+              <w:spacing w:before="40" w:after="40"/>
+            </w:pPr>
+            <w:r>
+              <w:rPr>
+                <w:sz w:val="19"/>
+                <w:color w:val="4F46E5"/>
+                <w:rFonts w:ascii="Courier New" w:hAnsi="Courier New"/>
+              </w:rPr>
+              <w:t>UCGVFxAa7nA</w:t>
+            </w:r>
+          </w:p>
+        </w:tc>
+        <w:tc>
+          <w:tcPr>
+            <w:tcW w:w="3360" w:type="dxa"/>
+            <w:shd w:val="clear" w:color="auto" w:fill="FFFFFF"/>
+          </w:tcPr>
+          <w:p>
+            <w:pPr>
+              <w:spacing w:before="40" w:after="40"/>
+            </w:pPr>
+            <w:r>
+              <w:rPr>
+                <w:sz w:val="19"/>
+                <w:color w:val="475569"/>
+              </w:rPr>
+              <w:t>Memahami transformasi, visi kelembagaan, serta makna logo dan komitmen baru BKKBN dalam melayani keluarga Indonesia yang berkualitas.</w:t>
+            </w:r>
+          </w:p>
+        </w:tc>
+      </w:tr>
+      <w:tr>
+        <w:tc>
+          <w:tcPr>
+            <w:tcW w:w="700" w:type="dxa"/>
+            <w:shd w:val="clear" w:color="auto" w:fill="F8FAFC"/>
+          </w:tcPr>
+          <w:p>
+            <w:pPr>
+              <w:spacing w:before="40" w:after="40"/>
+            </w:pPr>
+            <w:r>
+              <w:rPr>
+                <w:sz w:val="19"/>
+                <w:color w:val="334155"/>
+              </w:rPr>
+              <w:t>2</w:t>
+            </w:r>
+          </w:p>
+        </w:tc>
+        <w:tc>
+          <w:tcPr>
+            <w:tcW w:w="2800" w:type="dxa"/>
+            <w:shd w:val="clear" w:color="auto" w:fill="F8FAFC"/>
+          </w:tcPr>
+          <w:p>
+            <w:pPr>
+              <w:spacing w:before="40" w:after="40"/>
+            </w:pPr>
+            <w:r>
+              <w:rPr>
+                <w:b/>
+                <w:sz w:val="19"/>
+                <w:color w:val="0F172A"/>
+              </w:rPr>
+              <w:t>1.2: Program Bangga Kencana &amp; Percepatan Penurunan Stunting</w:t>
+            </w:r>
+          </w:p>
+        </w:tc>
+        <w:tc>
+          <w:tcPr>
+            <w:tcW w:w="1100" w:type="dxa"/>
+            <w:shd w:val="clear" w:color="auto" w:fill="F8FAFC"/>
+          </w:tcPr>
+          <w:p>
+            <w:pPr>
+              <w:spacing w:before="40" w:after="40"/>
+            </w:pPr>
+            <w:r>
+              <w:rPr>
+                <w:sz w:val="19"/>
+                <w:color w:val="059669"/>
+                <w:rFonts w:ascii="Courier New" w:hAnsi="Courier New"/>
+              </w:rPr>
+              <w:t>12:00</w:t>
+            </w:r>
+          </w:p>
+        </w:tc>
+        <w:tc>
+          <w:tcPr>
+            <w:tcW w:w="1400" w:type="dxa"/>
+            <w:shd w:val="clear" w:color="auto" w:fill="F8FAFC"/>
+          </w:tcPr>
+          <w:p>
+            <w:pPr>
+              <w:spacing w:before="40" w:after="40"/>
+            </w:pPr>
+            <w:r>
+              <w:rPr>
+                <w:sz w:val="19"/>
+                <w:color w:val="4F46E5"/>
+                <w:rFonts w:ascii="Courier New" w:hAnsi="Courier New"/>
+              </w:rPr>
+              <w:t>EA3wO1h8EX0</w:t>
+            </w:r>
+          </w:p>
+        </w:tc>
+        <w:tc>
+          <w:tcPr>
+            <w:tcW w:w="3360" w:type="dxa"/>
+            <w:shd w:val="clear" w:color="auto" w:fill="F8FAFC"/>
+          </w:tcPr>
+          <w:p>
+            <w:pPr>
+              <w:spacing w:before="40" w:after="40"/>
+            </w:pPr>
+            <w:r>
+              <w:rPr>
+                <w:sz w:val="19"/>
+                <w:color w:val="475569"/>
+              </w:rPr>
+              <w:t>Edukasi strategis mengenai pilar Pembangunan Keluarga, Kependudukan, dan Keluarga Berencana (Bangga Kencana) serta aksi percepatan penurunan stunting.</w:t>
+            </w:r>
+          </w:p>
+        </w:tc>
+      </w:tr>
+    </w:tbl>
+    <w:p>
+      <w:pPr>
+        <w:spacing w:before="0" w:after="140"/>
+      </w:pPr>
+    </w:p>
+    <w:tbl>
+      <w:tblPr>
+        <w:tblW w:w="9360" w:type="dxa"/>
+        <w:tblBorders>
+          <w:top w:val="none"/>
+          <w:left w:val="single" w:sz="28" w:space="0" w:color="059669"/>
+          <w:bottom w:val="none"/>
+          <w:right w:val="none"/>
+        </w:tblBorders>
+        <w:tblCellMar>
+          <w:top w:w="160" w:type="dxa"/>
+          <w:left w:w="260" w:type="dxa"/>
+          <w:bottom w:w="160" w:type="dxa"/>
+          <w:right w:w="260" w:type="dxa"/>
+        </w:tblCellMar>
+      </w:tblPr>
+      <w:tr>
+        <w:tc>
+          <w:tcPr>
+            <w:shd w:val="clear" w:color="auto" w:fill="ECFDF5"/>
+          </w:tcPr>
+          <w:p>
+            <w:pPr>
+              <w:spacing w:before="60" w:after="60"/>
+            </w:pPr>
+            <w:r>
+              <w:rPr>
+                <w:b/>
+                <w:color w:val="059669"/>
+                <w:sz w:val="22"/>
+              </w:rPr>
+              <w:t>SOAL KUIS EVALUASI PEMAHAMAN: MATERI 1.1 MAKNA &amp; FILOSOFI BKKBN</w:t>
+            </w:r>
+          </w:p>
+          <w:p>
+            <w:pPr>
+              <w:spacing w:before="0" w:after="50"/>
+            </w:pPr>
+            <w:r>
+              <w:rPr>
+                <w:color w:val="334155"/>
+                <w:sz w:val="21"/>
+              </w:rPr>
+              <w:t xml:space="preserve">Pertanyaan: Apa kepanjangan resmi dan mandat utama dari BKKBN?</w:t>
+            </w:r>
+          </w:p>
+          <w:p>
+            <w:pPr>
+              <w:spacing w:before="0" w:after="50"/>
+            </w:pPr>
+            <w:r>
+              <w:rPr>
+                <w:color w:val="334155"/>
+                <w:sz w:val="21"/>
+              </w:rPr>
+              <w:t xml:space="preserve"/>
+            </w:r>
+          </w:p>
+          <w:p>
+            <w:pPr>
+              <w:spacing w:before="0" w:after="50"/>
+            </w:pPr>
+            <w:r>
+              <w:rPr>
+                <w:color w:val="334155"/>
+                <w:sz w:val="21"/>
+              </w:rPr>
+              <w:t xml:space="preserve">• Pilihan A: Badan Kependudukan dan Keluarga Berencana Nasional  [KUNCI JAWABAN BENAR]</w:t>
+            </w:r>
+          </w:p>
+          <w:p>
+            <w:pPr>
+              <w:spacing w:before="0" w:after="50"/>
+            </w:pPr>
+            <w:r>
+              <w:rPr>
+                <w:color w:val="334155"/>
+                <w:sz w:val="21"/>
+              </w:rPr>
+              <w:t xml:space="preserve">• Pilihan B: Badan Koordinasi Kesejahteraan Bersama Nasional</w:t>
+            </w:r>
+          </w:p>
+          <w:p>
+            <w:pPr>
+              <w:spacing w:before="0" w:after="50"/>
+            </w:pPr>
+            <w:r>
+              <w:rPr>
+                <w:color w:val="334155"/>
+                <w:sz w:val="21"/>
+              </w:rPr>
+              <w:t xml:space="preserve">• Pilihan C: Badan Ketahanan Pangan dan Kependudukan Nasional</w:t>
+            </w:r>
+          </w:p>
+          <w:p>
+            <w:pPr>
+              <w:spacing w:before="0" w:after="50"/>
+            </w:pPr>
+            <w:r>
+              <w:rPr>
+                <w:color w:val="334155"/>
+                <w:sz w:val="21"/>
+              </w:rPr>
+              <w:t xml:space="preserve">• Pilihan D: Balai Konseling dan Keluarga Berencana Nasional</w:t>
+            </w:r>
+          </w:p>
+          <w:p>
+            <w:pPr>
+              <w:spacing w:before="0" w:after="50"/>
+            </w:pPr>
+            <w:r>
+              <w:rPr>
+                <w:color w:val="334155"/>
+                <w:sz w:val="21"/>
+              </w:rPr>
+              <w:t xml:space="preserve"/>
+            </w:r>
+          </w:p>
+          <w:p>
+            <w:pPr>
+              <w:spacing w:before="0" w:after="50"/>
+            </w:pPr>
+            <w:r>
+              <w:rPr>
+                <w:color w:val="334155"/>
+                <w:sz w:val="21"/>
+              </w:rPr>
+              <w:t xml:space="preserve">Pembahasan Pedagogis: BKKBN adalah Badan Kependudukan dan Keluarga Berencana Nasional yang bertugas melaksanakan pengendalian penduduk dan penyelenggaraan keluarga berencana.</w:t>
+            </w:r>
+          </w:p>
+        </w:tc>
+      </w:tr>
+    </w:tbl>
+    <w:p>
+      <w:pPr>
+        <w:spacing w:before="0" w:after="120"/>
+      </w:pPr>
+    </w:p>
+    <w:p>
+      <w:pPr>
+        <w:pStyle w:val="Heading2"/>
+        <w:spacing w:before="320" w:after="140"/>
+        <w:keepNext/>
+      </w:pPr>
+      <w:r>
+        <w:rPr>
+          <w:rFonts w:ascii="Plus Jakarta Sans" w:hAnsi="Plus Jakarta Sans"/>
+          <w:b/>
+          <w:sz w:val="28"/>
+          <w:color w:val="1E3A8A"/>
+        </w:rPr>
+        <w:t>3.2 Kursus 2: Apa sih SSK? (Pilar Lingkungan)</w:t>
+      </w:r>
+    </w:p>
+    <w:tbl>
+      <w:tblPr>
+        <w:tblW w:w="9360" w:type="dxa"/>
+        <w:tblBorders>
+          <w:top w:val="none"/>
+          <w:left w:val="single" w:sz="28" w:space="0" w:color="4F46E5"/>
+          <w:bottom w:val="none"/>
+          <w:right w:val="none"/>
+        </w:tblBorders>
+        <w:tblCellMar>
+          <w:top w:w="160" w:type="dxa"/>
+          <w:left w:w="260" w:type="dxa"/>
+          <w:bottom w:w="160" w:type="dxa"/>
+          <w:right w:w="260" w:type="dxa"/>
+        </w:tblCellMar>
+      </w:tblPr>
+      <w:tr>
+        <w:tc>
+          <w:tcPr>
+            <w:shd w:val="clear" w:color="auto" w:fill="EEF2FF"/>
+          </w:tcPr>
+          <w:p>
+            <w:pPr>
+              <w:spacing w:before="60" w:after="60"/>
+            </w:pPr>
+            <w:r>
+              <w:rPr>
+                <w:b/>
+                <w:color w:val="4F46E5"/>
+                <w:sz w:val="22"/>
+              </w:rPr>
+              <w:t>METADATA KURSUS RESMI: APA SIH SSK?</w:t>
+            </w:r>
+          </w:p>
+          <w:p>
+            <w:pPr>
+              <w:spacing w:before="0" w:after="50"/>
+            </w:pPr>
+            <w:r>
+              <w:rPr>
+                <w:color w:val="334155"/>
+                <w:sz w:val="21"/>
+              </w:rPr>
+              <w:t xml:space="preserve">Kategori: Materi Umum Lingkungan (Siaga Bumi)</w:t>
+            </w:r>
+          </w:p>
+          <w:p>
+            <w:pPr>
+              <w:spacing w:before="0" w:after="50"/>
+            </w:pPr>
+            <w:r>
+              <w:rPr>
+                <w:color w:val="334155"/>
+                <w:sz w:val="21"/>
+              </w:rPr>
+              <w:t xml:space="preserve">Sekolah Pengampu: Sekolah Rakyat Menengah Atas 44 Minahasa</w:t>
+            </w:r>
+          </w:p>
+          <w:p>
+            <w:pPr>
+              <w:spacing w:before="0" w:after="50"/>
+            </w:pPr>
+            <w:r>
+              <w:rPr>
+                <w:color w:val="334155"/>
+                <w:sz w:val="21"/>
+              </w:rPr>
+              <w:t xml:space="preserve">Instruktur Pengampu: Ibu Martha Runtuwene, S.Pd</w:t>
+            </w:r>
+          </w:p>
+          <w:p>
+            <w:pPr>
+              <w:spacing w:before="0" w:after="50"/>
+            </w:pPr>
+            <w:r>
+              <w:rPr>
+                <w:color w:val="334155"/>
+                <w:sz w:val="21"/>
+              </w:rPr>
+              <w:t xml:space="preserve">Tingkat: Pemula (SMP/SMA) | Slug: apa-sih-ssk-sekolah-siaga-kependudukan</w:t>
+            </w:r>
+          </w:p>
+          <w:p>
+            <w:pPr>
+              <w:spacing w:before="0" w:after="50"/>
+            </w:pPr>
+            <w:r>
+              <w:rPr>
+                <w:color w:val="334155"/>
+                <w:sz w:val="21"/>
+              </w:rPr>
+              <w:t xml:space="preserve">Akses Mode Galeri / Tamu: Tidak (Tertutup khusus siswa &amp; guru sekolah mitra)</w:t>
+            </w:r>
+          </w:p>
+          <w:p>
+            <w:pPr>
+              <w:spacing w:before="0" w:after="50"/>
+            </w:pPr>
+            <w:r>
+              <w:rPr>
+                <w:color w:val="334155"/>
+                <w:sz w:val="21"/>
+              </w:rPr>
+              <w:t xml:space="preserve">Deskripsi: Memahami filosofi Sekolah Siaga Kependudukan (SSK), integrasi materi wawasan kependudukan dan kepedulian lingkungan Siaga Bumi ke dalam mata pelajaran sekolah, serta pembentukan Pojok Kependudukan.</w:t>
+            </w:r>
+          </w:p>
+        </w:tc>
+      </w:tr>
+    </w:tbl>
+    <w:p>
+      <w:pPr>
+        <w:spacing w:before="0" w:after="120"/>
+      </w:pPr>
+    </w:p>
+    <w:tbl>
+      <w:tblPr>
+        <w:tblW w:w="9360" w:type="dxa"/>
+        <w:tblBorders>
+          <w:top w:val="single" w:sz="6" w:space="0" w:color="CBD5E1"/>
+          <w:left w:val="single" w:sz="6" w:space="0" w:color="CBD5E1"/>
+          <w:bottom w:val="single" w:sz="6" w:space="0" w:color="CBD5E1"/>
+          <w:right w:val="single" w:sz="6" w:space="0" w:color="CBD5E1"/>
+          <w:insideH w:val="single" w:sz="4" w:space="0" w:color="E2E8F0"/>
+          <w:insideV w:val="single" w:sz="4" w:space="0" w:color="E2E8F0"/>
+        </w:tblBorders>
+        <w:tblCellMar>
+          <w:top w:w="120" w:type="dxa"/>
+          <w:left w:w="140" w:type="dxa"/>
+          <w:bottom w:w="120" w:type="dxa"/>
+          <w:right w:w="140" w:type="dxa"/>
+        </w:tblCellMar>
+      </w:tblPr>
+      <w:tr>
+        <w:tc>
+          <w:tcPr>
+            <w:tcW w:w="700" w:type="dxa"/>
+            <w:shd w:val="clear" w:color="auto" w:fill="EEF2FF"/>
+          </w:tcPr>
+          <w:p>
+            <w:pPr>
+              <w:spacing w:before="40" w:after="40"/>
+            </w:pPr>
+            <w:r>
+              <w:rPr>
+                <w:b/>
+                <w:sz w:val="19"/>
+                <w:color w:val="312E81"/>
+              </w:rPr>
+              <w:t>No</w:t>
+            </w:r>
+          </w:p>
+        </w:tc>
+        <w:tc>
+          <w:tcPr>
+            <w:tcW w:w="2800" w:type="dxa"/>
+            <w:shd w:val="clear" w:color="auto" w:fill="EEF2FF"/>
+          </w:tcPr>
+          <w:p>
+            <w:pPr>
+              <w:spacing w:before="40" w:after="40"/>
+            </w:pPr>
+            <w:r>
+              <w:rPr>
+                <w:b/>
+                <w:sz w:val="19"/>
+                <w:color w:val="312E81"/>
+              </w:rPr>
+              <w:t>Judul Pelajaran Video</w:t>
+            </w:r>
+          </w:p>
+        </w:tc>
+        <w:tc>
+          <w:tcPr>
+            <w:tcW w:w="1100" w:type="dxa"/>
+            <w:shd w:val="clear" w:color="auto" w:fill="EEF2FF"/>
+          </w:tcPr>
+          <w:p>
+            <w:pPr>
+              <w:spacing w:before="40" w:after="40"/>
+            </w:pPr>
+            <w:r>
+              <w:rPr>
+                <w:b/>
+                <w:sz w:val="19"/>
+                <w:color w:val="312E81"/>
+              </w:rPr>
+              <w:t>Durasi</w:t>
+            </w:r>
+          </w:p>
+        </w:tc>
+        <w:tc>
+          <w:tcPr>
+            <w:tcW w:w="1400" w:type="dxa"/>
+            <w:shd w:val="clear" w:color="auto" w:fill="EEF2FF"/>
+          </w:tcPr>
+          <w:p>
+            <w:pPr>
+              <w:spacing w:before="40" w:after="40"/>
+            </w:pPr>
+            <w:r>
+              <w:rPr>
+                <w:b/>
+                <w:sz w:val="19"/>
+                <w:color w:val="312E81"/>
+              </w:rPr>
+              <w:t>ID YouTube</w:t>
+            </w:r>
+          </w:p>
+        </w:tc>
+        <w:tc>
+          <w:tcPr>
+            <w:tcW w:w="3360" w:type="dxa"/>
+            <w:shd w:val="clear" w:color="auto" w:fill="EEF2FF"/>
+          </w:tcPr>
+          <w:p>
+            <w:pPr>
+              <w:spacing w:before="40" w:after="40"/>
+            </w:pPr>
+            <w:r>
+              <w:rPr>
+                <w:b/>
+                <w:sz w:val="19"/>
+                <w:color w:val="312E81"/>
+              </w:rPr>
+              <w:t>Ringkasan Pembelajaran</w:t>
+            </w:r>
+          </w:p>
+        </w:tc>
+      </w:tr>
+      <w:tr>
+        <w:tc>
+          <w:tcPr>
+            <w:tcW w:w="700" w:type="dxa"/>
+            <w:shd w:val="clear" w:color="auto" w:fill="FFFFFF"/>
+          </w:tcPr>
+          <w:p>
+            <w:pPr>
+              <w:spacing w:before="40" w:after="40"/>
+            </w:pPr>
+            <w:r>
+              <w:rPr>
+                <w:sz w:val="19"/>
+                <w:color w:val="334155"/>
+              </w:rPr>
+              <w:t>1</w:t>
+            </w:r>
+          </w:p>
+        </w:tc>
+        <w:tc>
+          <w:tcPr>
+            <w:tcW w:w="2800" w:type="dxa"/>
+            <w:shd w:val="clear" w:color="auto" w:fill="FFFFFF"/>
+          </w:tcPr>
+          <w:p>
+            <w:pPr>
+              <w:spacing w:before="40" w:after="40"/>
+            </w:pPr>
+            <w:r>
+              <w:rPr>
+                <w:b/>
+                <w:sz w:val="19"/>
+                <w:color w:val="0F172A"/>
+              </w:rPr>
+              <w:t>1.1: Apa Sih Sekolah Siaga Kependudukan (SSK)?</w:t>
+            </w:r>
+          </w:p>
+        </w:tc>
+        <w:tc>
+          <w:tcPr>
+            <w:tcW w:w="1100" w:type="dxa"/>
+            <w:shd w:val="clear" w:color="auto" w:fill="FFFFFF"/>
+          </w:tcPr>
+          <w:p>
+            <w:pPr>
+              <w:spacing w:before="40" w:after="40"/>
+            </w:pPr>
+            <w:r>
+              <w:rPr>
+                <w:sz w:val="19"/>
+                <w:color w:val="059669"/>
+                <w:rFonts w:ascii="Courier New" w:hAnsi="Courier New"/>
+              </w:rPr>
+              <w:t>09:00</w:t>
+            </w:r>
+          </w:p>
+        </w:tc>
+        <w:tc>
+          <w:tcPr>
+            <w:tcW w:w="1400" w:type="dxa"/>
+            <w:shd w:val="clear" w:color="auto" w:fill="FFFFFF"/>
+          </w:tcPr>
+          <w:p>
+            <w:pPr>
+              <w:spacing w:before="40" w:after="40"/>
+            </w:pPr>
+            <w:r>
+              <w:rPr>
+                <w:sz w:val="19"/>
+                <w:color w:val="4F46E5"/>
+                <w:rFonts w:ascii="Courier New" w:hAnsi="Courier New"/>
+              </w:rPr>
+              <w:t>6bGlT6CVohg</w:t>
+            </w:r>
+          </w:p>
+        </w:tc>
+        <w:tc>
+          <w:tcPr>
+            <w:tcW w:w="3360" w:type="dxa"/>
+            <w:shd w:val="clear" w:color="auto" w:fill="FFFFFF"/>
+          </w:tcPr>
+          <w:p>
+            <w:pPr>
+              <w:spacing w:before="40" w:after="40"/>
+            </w:pPr>
+            <w:r>
+              <w:rPr>
+                <w:sz w:val="19"/>
+                <w:color w:val="475569"/>
+              </w:rPr>
+              <w:t>Menjelaskan konsep dasar Sekolah Siaga Kependudukan (SSK), tujuan integrasi materi kependudukan ke dalam mata pelajaran sekolah, serta urgensi kepedulian remaja.</w:t>
+            </w:r>
+          </w:p>
+        </w:tc>
+      </w:tr>
+      <w:tr>
+        <w:tc>
+          <w:tcPr>
+            <w:tcW w:w="700" w:type="dxa"/>
+            <w:shd w:val="clear" w:color="auto" w:fill="F8FAFC"/>
+          </w:tcPr>
+          <w:p>
+            <w:pPr>
+              <w:spacing w:before="40" w:after="40"/>
+            </w:pPr>
+            <w:r>
+              <w:rPr>
+                <w:sz w:val="19"/>
+                <w:color w:val="334155"/>
+              </w:rPr>
+              <w:t>2</w:t>
+            </w:r>
+          </w:p>
+        </w:tc>
+        <w:tc>
+          <w:tcPr>
+            <w:tcW w:w="2800" w:type="dxa"/>
+            <w:shd w:val="clear" w:color="auto" w:fill="F8FAFC"/>
+          </w:tcPr>
+          <w:p>
+            <w:pPr>
+              <w:spacing w:before="40" w:after="40"/>
+            </w:pPr>
+            <w:r>
+              <w:rPr>
+                <w:b/>
+                <w:sz w:val="19"/>
+                <w:color w:val="0F172A"/>
+              </w:rPr>
+              <w:t>1.2: Panduan Pengenalan &amp; Pojok Kependudukan SSK</w:t>
+            </w:r>
+          </w:p>
+        </w:tc>
+        <w:tc>
+          <w:tcPr>
+            <w:tcW w:w="1100" w:type="dxa"/>
+            <w:shd w:val="clear" w:color="auto" w:fill="F8FAFC"/>
+          </w:tcPr>
+          <w:p>
+            <w:pPr>
+              <w:spacing w:before="40" w:after="40"/>
+            </w:pPr>
+            <w:r>
+              <w:rPr>
+                <w:sz w:val="19"/>
+                <w:color w:val="059669"/>
+                <w:rFonts w:ascii="Courier New" w:hAnsi="Courier New"/>
+              </w:rPr>
+              <w:t>11:00</w:t>
+            </w:r>
+          </w:p>
+        </w:tc>
+        <w:tc>
+          <w:tcPr>
+            <w:tcW w:w="1400" w:type="dxa"/>
+            <w:shd w:val="clear" w:color="auto" w:fill="F8FAFC"/>
+          </w:tcPr>
+          <w:p>
+            <w:pPr>
+              <w:spacing w:before="40" w:after="40"/>
+            </w:pPr>
+            <w:r>
+              <w:rPr>
+                <w:sz w:val="19"/>
+                <w:color w:val="4F46E5"/>
+                <w:rFonts w:ascii="Courier New" w:hAnsi="Courier New"/>
+              </w:rPr>
+              <w:t>x8PgjAKr-h8</w:t>
+            </w:r>
+          </w:p>
+        </w:tc>
+        <w:tc>
+          <w:tcPr>
+            <w:tcW w:w="3360" w:type="dxa"/>
+            <w:shd w:val="clear" w:color="auto" w:fill="F8FAFC"/>
+          </w:tcPr>
+          <w:p>
+            <w:pPr>
+              <w:spacing w:before="40" w:after="40"/>
+            </w:pPr>
+            <w:r>
+              <w:rPr>
+                <w:sz w:val="19"/>
+                <w:color w:val="475569"/>
+              </w:rPr>
+              <w:t>Tata cara pembentukan Pojok Kependudukan (Population Corner) di sekolah sebagai sentra literasi, sarana konseling sebaya, dan media integrasi edukasi lingkungan Siaga Bumi.</w:t>
+            </w:r>
+          </w:p>
+        </w:tc>
+      </w:tr>
+    </w:tbl>
+    <w:p>
+      <w:pPr>
+        <w:spacing w:before="0" w:after="140"/>
+      </w:pPr>
+    </w:p>
+    <w:tbl>
+      <w:tblPr>
+        <w:tblW w:w="9360" w:type="dxa"/>
+        <w:tblBorders>
+          <w:top w:val="none"/>
+          <w:left w:val="single" w:sz="28" w:space="0" w:color="059669"/>
+          <w:bottom w:val="none"/>
+          <w:right w:val="none"/>
+        </w:tblBorders>
+        <w:tblCellMar>
+          <w:top w:w="160" w:type="dxa"/>
+          <w:left w:w="260" w:type="dxa"/>
+          <w:bottom w:w="160" w:type="dxa"/>
+          <w:right w:w="260" w:type="dxa"/>
+        </w:tblCellMar>
+      </w:tblPr>
+      <w:tr>
+        <w:tc>
+          <w:tcPr>
+            <w:shd w:val="clear" w:color="auto" w:fill="ECFDF5"/>
+          </w:tcPr>
+          <w:p>
+            <w:pPr>
+              <w:spacing w:before="60" w:after="60"/>
+            </w:pPr>
+            <w:r>
+              <w:rPr>
+                <w:b/>
+                <w:color w:val="059669"/>
+                <w:sz w:val="22"/>
+              </w:rPr>
+              <w:t>SOAL KUIS EVALUASI PEMAHAMAN: MATERI 1.1 KONSEP DASAR SSK</w:t>
+            </w:r>
+          </w:p>
+          <w:p>
+            <w:pPr>
+              <w:spacing w:before="0" w:after="50"/>
+            </w:pPr>
+            <w:r>
+              <w:rPr>
+                <w:color w:val="334155"/>
+                <w:sz w:val="21"/>
+              </w:rPr>
+              <w:t xml:space="preserve">Pertanyaan: Apa fungsi utama dari Pojok Kependudukan (Population Corner) di Sekolah Siaga Kependudukan?</w:t>
+            </w:r>
+          </w:p>
+          <w:p>
+            <w:pPr>
+              <w:spacing w:before="0" w:after="50"/>
+            </w:pPr>
+            <w:r>
+              <w:rPr>
+                <w:color w:val="334155"/>
+                <w:sz w:val="21"/>
+              </w:rPr>
+              <w:t xml:space="preserve"/>
+            </w:r>
+          </w:p>
+          <w:p>
+            <w:pPr>
+              <w:spacing w:before="0" w:after="50"/>
+            </w:pPr>
+            <w:r>
+              <w:rPr>
+                <w:color w:val="334155"/>
+                <w:sz w:val="21"/>
+              </w:rPr>
+              <w:t xml:space="preserve">• Pilihan A: Sebagai ruang pertemuan staf guru saja</w:t>
+            </w:r>
+          </w:p>
+          <w:p>
+            <w:pPr>
+              <w:spacing w:before="0" w:after="50"/>
+            </w:pPr>
+            <w:r>
+              <w:rPr>
+                <w:color w:val="334155"/>
+                <w:sz w:val="21"/>
+              </w:rPr>
+              <w:t xml:space="preserve">• Pilihan B: Sebagai pusat informasi, literasi, perpustakaan mini, dan diskusi sebaya tentang kependudukan  [KUNCI JAWABAN BENAR]</w:t>
+            </w:r>
+          </w:p>
+          <w:p>
+            <w:pPr>
+              <w:spacing w:before="0" w:after="50"/>
+            </w:pPr>
+            <w:r>
+              <w:rPr>
+                <w:color w:val="334155"/>
+                <w:sz w:val="21"/>
+              </w:rPr>
+              <w:t xml:space="preserve">• Pilihan C: Sebagai tempat penyimpanan alat olahraga sekolah</w:t>
+            </w:r>
+          </w:p>
+          <w:p>
+            <w:pPr>
+              <w:spacing w:before="0" w:after="50"/>
+            </w:pPr>
+            <w:r>
+              <w:rPr>
+                <w:color w:val="334155"/>
+                <w:sz w:val="21"/>
+              </w:rPr>
+              <w:t xml:space="preserve">• Pilihan D: Sebagai ruang bimbingan konseling khusus pelanggaran disiplin</w:t>
+            </w:r>
+          </w:p>
+          <w:p>
+            <w:pPr>
+              <w:spacing w:before="0" w:after="50"/>
+            </w:pPr>
+            <w:r>
+              <w:rPr>
+                <w:color w:val="334155"/>
+                <w:sz w:val="21"/>
+              </w:rPr>
+              <w:t xml:space="preserve"/>
+            </w:r>
+          </w:p>
+          <w:p>
+            <w:pPr>
+              <w:spacing w:before="0" w:after="50"/>
+            </w:pPr>
+            <w:r>
+              <w:rPr>
+                <w:color w:val="334155"/>
+                <w:sz w:val="21"/>
+              </w:rPr>
+              <w:t xml:space="preserve">Pembahasan Pedagogis: Pojok Kependudukan adalah sarana edukasi dan diskusi interaktif bagi siswa mengenai dinamika kependudukan dan isu lingkungan sekitar.</w:t>
+            </w:r>
+          </w:p>
+        </w:tc>
+      </w:tr>
+    </w:tbl>
+    <w:p>
+      <w:pPr>
+        <w:spacing w:before="0" w:after="120"/>
+      </w:pPr>
+    </w:p>
+    <w:p>
+      <w:pPr>
+        <w:pStyle w:val="Heading2"/>
+        <w:spacing w:before="320" w:after="140"/>
+        <w:keepNext/>
+      </w:pPr>
+      <w:r>
+        <w:rPr>
+          <w:rFonts w:ascii="Plus Jakarta Sans" w:hAnsi="Plus Jakarta Sans"/>
+          <w:b/>
+          <w:sz w:val="28"/>
+          <w:color w:val="1E3A8A"/>
+        </w:rPr>
+        <w:t>3.3 Kursus 3: Pencegahan &amp; Penanganan Kekerasan Seksual (PPKS)</w:t>
+      </w:r>
+    </w:p>
+    <w:tbl>
+      <w:tblPr>
+        <w:tblW w:w="9360" w:type="dxa"/>
+        <w:tblBorders>
+          <w:top w:val="none"/>
+          <w:left w:val="single" w:sz="28" w:space="0" w:color="4F46E5"/>
+          <w:bottom w:val="none"/>
+          <w:right w:val="none"/>
+        </w:tblBorders>
+        <w:tblCellMar>
+          <w:top w:w="160" w:type="dxa"/>
+          <w:left w:w="260" w:type="dxa"/>
+          <w:bottom w:w="160" w:type="dxa"/>
+          <w:right w:w="260" w:type="dxa"/>
+        </w:tblCellMar>
+      </w:tblPr>
+      <w:tr>
+        <w:tc>
+          <w:tcPr>
+            <w:shd w:val="clear" w:color="auto" w:fill="EEF2FF"/>
+          </w:tcPr>
+          <w:p>
+            <w:pPr>
+              <w:spacing w:before="60" w:after="60"/>
+            </w:pPr>
+            <w:r>
+              <w:rPr>
+                <w:b/>
+                <w:color w:val="4F46E5"/>
+                <w:sz w:val="22"/>
+              </w:rPr>
+              <w:t>METADATA KURSUS RESMI: PENCEGAHAN &amp; PENANGANAN KEKERASAN SEKSUAL (PPKS)</w:t>
+            </w:r>
+          </w:p>
+          <w:p>
+            <w:pPr>
+              <w:spacing w:before="0" w:after="50"/>
+            </w:pPr>
+            <w:r>
+              <w:rPr>
+                <w:color w:val="334155"/>
+                <w:sz w:val="21"/>
+              </w:rPr>
+              <w:t xml:space="preserve">Kategori: Kekerasan Sexual (Perlindungan Remaja &amp; Ramah Anak)</w:t>
+            </w:r>
+          </w:p>
+          <w:p>
+            <w:pPr>
+              <w:spacing w:before="0" w:after="50"/>
+            </w:pPr>
+            <w:r>
+              <w:rPr>
+                <w:color w:val="334155"/>
+                <w:sz w:val="21"/>
+              </w:rPr>
+              <w:t xml:space="preserve">Sekolah Pengampu: SMP Negeri 1 Bitung</w:t>
+            </w:r>
+          </w:p>
+          <w:p>
+            <w:pPr>
+              <w:spacing w:before="0" w:after="50"/>
+            </w:pPr>
+            <w:r>
+              <w:rPr>
+                <w:color w:val="334155"/>
+                <w:sz w:val="21"/>
+              </w:rPr>
+              <w:t xml:space="preserve">Instruktur Pengampu: Dra. Maria Sondakh, M.Si</w:t>
+            </w:r>
+          </w:p>
+          <w:p>
+            <w:pPr>
+              <w:spacing w:before="0" w:after="50"/>
+            </w:pPr>
+            <w:r>
+              <w:rPr>
+                <w:color w:val="334155"/>
+                <w:sz w:val="21"/>
+              </w:rPr>
+              <w:t xml:space="preserve">Tingkat: Pemula (SMP/SMA) | Slug: pencegahan-dan-penanganan-kekerasan-seksual-ppks</w:t>
+            </w:r>
+          </w:p>
+          <w:p>
+            <w:pPr>
+              <w:spacing w:before="0" w:after="50"/>
+            </w:pPr>
+            <w:r>
+              <w:rPr>
+                <w:color w:val="334155"/>
+                <w:sz w:val="21"/>
+              </w:rPr>
+              <w:t xml:space="preserve">Akses Mode Galeri / Tamu: Ya (is_visible_to_guest = true)</w:t>
+            </w:r>
+          </w:p>
+          <w:p>
+            <w:pPr>
+              <w:spacing w:before="0" w:after="50"/>
+            </w:pPr>
+            <w:r>
+              <w:rPr>
+                <w:color w:val="334155"/>
+                <w:sz w:val="21"/>
+              </w:rPr>
+              <w:t xml:space="preserve">Deskripsi: Pedoman komprehensif bagi pelajar dan pendidik dalam mengidentifikasi, mencegah, serta menangani kekerasan seksual di satuan pendidikan dengan pendekatan ramah anak dan berkeadilan.</w:t>
+            </w:r>
+          </w:p>
+        </w:tc>
+      </w:tr>
+    </w:tbl>
+    <w:p>
+      <w:pPr>
+        <w:spacing w:before="0" w:after="120"/>
+      </w:pPr>
+    </w:p>
+    <w:tbl>
+      <w:tblPr>
+        <w:tblW w:w="9360" w:type="dxa"/>
+        <w:tblBorders>
+          <w:top w:val="single" w:sz="6" w:space="0" w:color="CBD5E1"/>
+          <w:left w:val="single" w:sz="6" w:space="0" w:color="CBD5E1"/>
+          <w:bottom w:val="single" w:sz="6" w:space="0" w:color="CBD5E1"/>
+          <w:right w:val="single" w:sz="6" w:space="0" w:color="CBD5E1"/>
+          <w:insideH w:val="single" w:sz="4" w:space="0" w:color="E2E8F0"/>
+          <w:insideV w:val="single" w:sz="4" w:space="0" w:color="E2E8F0"/>
+        </w:tblBorders>
+        <w:tblCellMar>
+          <w:top w:w="120" w:type="dxa"/>
+          <w:left w:w="140" w:type="dxa"/>
+          <w:bottom w:w="120" w:type="dxa"/>
+          <w:right w:w="140" w:type="dxa"/>
+        </w:tblCellMar>
+      </w:tblPr>
+      <w:tr>
+        <w:tc>
+          <w:tcPr>
+            <w:tcW w:w="700" w:type="dxa"/>
+            <w:shd w:val="clear" w:color="auto" w:fill="EEF2FF"/>
+          </w:tcPr>
+          <w:p>
+            <w:pPr>
+              <w:spacing w:before="40" w:after="40"/>
+            </w:pPr>
+            <w:r>
+              <w:rPr>
+                <w:b/>
+                <w:sz w:val="19"/>
+                <w:color w:val="312E81"/>
+              </w:rPr>
+              <w:t>No</w:t>
+            </w:r>
+          </w:p>
+        </w:tc>
+        <w:tc>
+          <w:tcPr>
+            <w:tcW w:w="2800" w:type="dxa"/>
+            <w:shd w:val="clear" w:color="auto" w:fill="EEF2FF"/>
+          </w:tcPr>
+          <w:p>
+            <w:pPr>
+              <w:spacing w:before="40" w:after="40"/>
+            </w:pPr>
+            <w:r>
+              <w:rPr>
+                <w:b/>
+                <w:sz w:val="19"/>
+                <w:color w:val="312E81"/>
+              </w:rPr>
+              <w:t>Judul Pelajaran Video</w:t>
+            </w:r>
+          </w:p>
+        </w:tc>
+        <w:tc>
+          <w:tcPr>
+            <w:tcW w:w="1100" w:type="dxa"/>
+            <w:shd w:val="clear" w:color="auto" w:fill="EEF2FF"/>
+          </w:tcPr>
+          <w:p>
+            <w:pPr>
+              <w:spacing w:before="40" w:after="40"/>
+            </w:pPr>
+            <w:r>
+              <w:rPr>
+                <w:b/>
+                <w:sz w:val="19"/>
+                <w:color w:val="312E81"/>
+              </w:rPr>
+              <w:t>Durasi</w:t>
+            </w:r>
+          </w:p>
+        </w:tc>
+        <w:tc>
+          <w:tcPr>
+            <w:tcW w:w="1400" w:type="dxa"/>
+            <w:shd w:val="clear" w:color="auto" w:fill="EEF2FF"/>
+          </w:tcPr>
+          <w:p>
+            <w:pPr>
+              <w:spacing w:before="40" w:after="40"/>
+            </w:pPr>
+            <w:r>
+              <w:rPr>
+                <w:b/>
+                <w:sz w:val="19"/>
+                <w:color w:val="312E81"/>
+              </w:rPr>
+              <w:t>ID YouTube</w:t>
+            </w:r>
+          </w:p>
+        </w:tc>
+        <w:tc>
+          <w:tcPr>
+            <w:tcW w:w="3360" w:type="dxa"/>
+            <w:shd w:val="clear" w:color="auto" w:fill="EEF2FF"/>
+          </w:tcPr>
+          <w:p>
+            <w:pPr>
+              <w:spacing w:before="40" w:after="40"/>
+            </w:pPr>
+            <w:r>
+              <w:rPr>
+                <w:b/>
+                <w:sz w:val="19"/>
+                <w:color w:val="312E81"/>
+              </w:rPr>
+              <w:t>Ringkasan Pembelajaran</w:t>
+            </w:r>
+          </w:p>
+        </w:tc>
+      </w:tr>
+      <w:tr>
+        <w:tc>
+          <w:tcPr>
+            <w:tcW w:w="700" w:type="dxa"/>
+            <w:shd w:val="clear" w:color="auto" w:fill="FFFFFF"/>
+          </w:tcPr>
+          <w:p>
+            <w:pPr>
+              <w:spacing w:before="40" w:after="40"/>
+            </w:pPr>
+            <w:r>
+              <w:rPr>
+                <w:sz w:val="19"/>
+                <w:color w:val="334155"/>
+              </w:rPr>
+              <w:t>1</w:t>
+            </w:r>
+          </w:p>
+        </w:tc>
+        <w:tc>
+          <w:tcPr>
+            <w:tcW w:w="2800" w:type="dxa"/>
+            <w:shd w:val="clear" w:color="auto" w:fill="FFFFFF"/>
+          </w:tcPr>
+          <w:p>
+            <w:pPr>
+              <w:spacing w:before="40" w:after="40"/>
+            </w:pPr>
+            <w:r>
+              <w:rPr>
+                <w:b/>
+                <w:sz w:val="19"/>
+                <w:color w:val="0F172A"/>
+              </w:rPr>
+              <w:t>1.1: Memahami Batasan &amp; Pencegahan Kekerasan Seksual di Sekolah</w:t>
+            </w:r>
+          </w:p>
+        </w:tc>
+        <w:tc>
+          <w:tcPr>
+            <w:tcW w:w="1100" w:type="dxa"/>
+            <w:shd w:val="clear" w:color="auto" w:fill="FFFFFF"/>
+          </w:tcPr>
+          <w:p>
+            <w:pPr>
+              <w:spacing w:before="40" w:after="40"/>
+            </w:pPr>
+            <w:r>
+              <w:rPr>
+                <w:sz w:val="19"/>
+                <w:color w:val="059669"/>
+                <w:rFonts w:ascii="Courier New" w:hAnsi="Courier New"/>
+              </w:rPr>
+              <w:t>09:00</w:t>
+            </w:r>
+          </w:p>
+        </w:tc>
+        <w:tc>
+          <w:tcPr>
+            <w:tcW w:w="1400" w:type="dxa"/>
+            <w:shd w:val="clear" w:color="auto" w:fill="FFFFFF"/>
+          </w:tcPr>
+          <w:p>
+            <w:pPr>
+              <w:spacing w:before="40" w:after="40"/>
+            </w:pPr>
+            <w:r>
+              <w:rPr>
+                <w:sz w:val="19"/>
+                <w:color w:val="4F46E5"/>
+                <w:rFonts w:ascii="Courier New" w:hAnsi="Courier New"/>
+              </w:rPr>
+              <w:t>EA3wO1h8EX0</w:t>
+            </w:r>
+          </w:p>
+        </w:tc>
+        <w:tc>
+          <w:tcPr>
+            <w:tcW w:w="3360" w:type="dxa"/>
+            <w:shd w:val="clear" w:color="auto" w:fill="FFFFFF"/>
+          </w:tcPr>
+          <w:p>
+            <w:pPr>
+              <w:spacing w:before="40" w:after="40"/>
+            </w:pPr>
+            <w:r>
+              <w:rPr>
+                <w:sz w:val="19"/>
+                <w:color w:val="475569"/>
+              </w:rPr>
+              <w:t>Mengenali bentuk-bentuk kekerasan seksual fisik dan verbal, membangun kesadaran batasan pribadi remaja (consent), dan menciptakan ruang aman di lingkungan belajar.</w:t>
+            </w:r>
+          </w:p>
+        </w:tc>
+      </w:tr>
+      <w:tr>
+        <w:tc>
+          <w:tcPr>
+            <w:tcW w:w="700" w:type="dxa"/>
+            <w:shd w:val="clear" w:color="auto" w:fill="F8FAFC"/>
+          </w:tcPr>
+          <w:p>
+            <w:pPr>
+              <w:spacing w:before="40" w:after="40"/>
+            </w:pPr>
+            <w:r>
+              <w:rPr>
+                <w:sz w:val="19"/>
+                <w:color w:val="334155"/>
+              </w:rPr>
+              <w:t>2</w:t>
+            </w:r>
+          </w:p>
+        </w:tc>
+        <w:tc>
+          <w:tcPr>
+            <w:tcW w:w="2800" w:type="dxa"/>
+            <w:shd w:val="clear" w:color="auto" w:fill="F8FAFC"/>
+          </w:tcPr>
+          <w:p>
+            <w:pPr>
+              <w:spacing w:before="40" w:after="40"/>
+            </w:pPr>
+            <w:r>
+              <w:rPr>
+                <w:b/>
+                <w:sz w:val="19"/>
+                <w:color w:val="0F172A"/>
+              </w:rPr>
+              <w:t>1.2: Peran Satgas PPKS &amp; Mekanisme Pengaduan Ramah Anak</w:t>
+            </w:r>
+          </w:p>
+        </w:tc>
+        <w:tc>
+          <w:tcPr>
+            <w:tcW w:w="1100" w:type="dxa"/>
+            <w:shd w:val="clear" w:color="auto" w:fill="F8FAFC"/>
+          </w:tcPr>
+          <w:p>
+            <w:pPr>
+              <w:spacing w:before="40" w:after="40"/>
+            </w:pPr>
+            <w:r>
+              <w:rPr>
+                <w:sz w:val="19"/>
+                <w:color w:val="059669"/>
+                <w:rFonts w:ascii="Courier New" w:hAnsi="Courier New"/>
+              </w:rPr>
+              <w:t>10:00</w:t>
+            </w:r>
+          </w:p>
+        </w:tc>
+        <w:tc>
+          <w:tcPr>
+            <w:tcW w:w="1400" w:type="dxa"/>
+            <w:shd w:val="clear" w:color="auto" w:fill="F8FAFC"/>
+          </w:tcPr>
+          <w:p>
+            <w:pPr>
+              <w:spacing w:before="40" w:after="40"/>
+            </w:pPr>
+            <w:r>
+              <w:rPr>
+                <w:sz w:val="19"/>
+                <w:color w:val="4F46E5"/>
+                <w:rFonts w:ascii="Courier New" w:hAnsi="Courier New"/>
+              </w:rPr>
+              <w:t>UCGVFxAa7nA</w:t>
+            </w:r>
+          </w:p>
+        </w:tc>
+        <w:tc>
+          <w:tcPr>
+            <w:tcW w:w="3360" w:type="dxa"/>
+            <w:shd w:val="clear" w:color="auto" w:fill="F8FAFC"/>
+          </w:tcPr>
+          <w:p>
+            <w:pPr>
+              <w:spacing w:before="40" w:after="40"/>
+            </w:pPr>
+            <w:r>
+              <w:rPr>
+                <w:sz w:val="19"/>
+                <w:color w:val="475569"/>
+              </w:rPr>
+              <w:t>Alur pelaporan yang aman dan terpercaya, perlindungan identitas korban, serta peran konseling sebaya dan guru BK dalam mendampingi peserta didik.</w:t>
+            </w:r>
+          </w:p>
+        </w:tc>
+      </w:tr>
+    </w:tbl>
+    <w:p>
+      <w:pPr>
+        <w:spacing w:before="0" w:after="140"/>
+      </w:pPr>
+    </w:p>
+    <w:tbl>
+      <w:tblPr>
+        <w:tblW w:w="9360" w:type="dxa"/>
+        <w:tblBorders>
+          <w:top w:val="none"/>
+          <w:left w:val="single" w:sz="28" w:space="0" w:color="059669"/>
+          <w:bottom w:val="none"/>
+          <w:right w:val="none"/>
+        </w:tblBorders>
+        <w:tblCellMar>
+          <w:top w:w="160" w:type="dxa"/>
+          <w:left w:w="260" w:type="dxa"/>
+          <w:bottom w:w="160" w:type="dxa"/>
+          <w:right w:w="260" w:type="dxa"/>
+        </w:tblCellMar>
+      </w:tblPr>
+      <w:tr>
+        <w:tc>
+          <w:tcPr>
+            <w:shd w:val="clear" w:color="auto" w:fill="ECFDF5"/>
+          </w:tcPr>
+          <w:p>
+            <w:pPr>
+              <w:spacing w:before="60" w:after="60"/>
+            </w:pPr>
+            <w:r>
+              <w:rPr>
+                <w:b/>
+                <w:color w:val="059669"/>
+                <w:sz w:val="22"/>
+              </w:rPr>
+              <w:t>SOAL KUIS EVALUASI PEMAHAMAN: MATERI 1.1 PENCEGAHAN PPKS DI SEKOLAH</w:t>
+            </w:r>
+          </w:p>
+          <w:p>
+            <w:pPr>
+              <w:spacing w:before="0" w:after="50"/>
+            </w:pPr>
+            <w:r>
+              <w:rPr>
+                <w:color w:val="334155"/>
+                <w:sz w:val="21"/>
+              </w:rPr>
+              <w:t xml:space="preserve">Pertanyaan: Apa langkah pertama yang tepat dilakukan apabila melihat atau mengalami tindakan kekerasan seksual di sekolah?</w:t>
+            </w:r>
+          </w:p>
+          <w:p>
+            <w:pPr>
+              <w:spacing w:before="0" w:after="50"/>
+            </w:pPr>
+            <w:r>
+              <w:rPr>
+                <w:color w:val="334155"/>
+                <w:sz w:val="21"/>
+              </w:rPr>
+              <w:t xml:space="preserve"/>
+            </w:r>
+          </w:p>
+          <w:p>
+            <w:pPr>
+              <w:spacing w:before="0" w:after="50"/>
+            </w:pPr>
+            <w:r>
+              <w:rPr>
+                <w:color w:val="334155"/>
+                <w:sz w:val="21"/>
+              </w:rPr>
+              <w:t xml:space="preserve">• Pilihan A: Menyimpan rahasia dan merasa bersalah sendiri</w:t>
+            </w:r>
+          </w:p>
+          <w:p>
+            <w:pPr>
+              <w:spacing w:before="0" w:after="50"/>
+            </w:pPr>
+            <w:r>
+              <w:rPr>
+                <w:color w:val="334155"/>
+                <w:sz w:val="21"/>
+              </w:rPr>
+              <w:t xml:space="preserve">• Pilihan B: Segera melapor ke Satgas PPKS, guru BK, atau orang dewasa terpercaya yang aman  [KUNCI JAWABAN BENAR]</w:t>
+            </w:r>
+          </w:p>
+          <w:p>
+            <w:pPr>
+              <w:spacing w:before="0" w:after="50"/>
+            </w:pPr>
+            <w:r>
+              <w:rPr>
+                <w:color w:val="334155"/>
+                <w:sz w:val="21"/>
+              </w:rPr>
+              <w:t xml:space="preserve">• Pilihan C: Membalas dengan kekerasan fisik serupa</w:t>
+            </w:r>
+          </w:p>
+          <w:p>
+            <w:pPr>
+              <w:spacing w:before="0" w:after="50"/>
+            </w:pPr>
+            <w:r>
+              <w:rPr>
+                <w:color w:val="334155"/>
+                <w:sz w:val="21"/>
+              </w:rPr>
+              <w:t xml:space="preserve">• Pilihan D: Membagikan kejadian tersebut ke media sosial tanpa perlindungan privasi</w:t>
+            </w:r>
+          </w:p>
+          <w:p>
+            <w:pPr>
+              <w:spacing w:before="0" w:after="50"/>
+            </w:pPr>
+            <w:r>
+              <w:rPr>
+                <w:color w:val="334155"/>
+                <w:sz w:val="21"/>
+              </w:rPr>
+              <w:t xml:space="preserve"/>
+            </w:r>
+          </w:p>
+          <w:p>
+            <w:pPr>
+              <w:spacing w:before="0" w:after="50"/>
+            </w:pPr>
+            <w:r>
+              <w:rPr>
+                <w:color w:val="334155"/>
+                <w:sz w:val="21"/>
+              </w:rPr>
+              <w:t xml:space="preserve">Pembahasan Pedagogis: Melaporkan kepada Satgas PPKS atau guru BK menjamin perlindungan privasi, pendampingan psikologis, dan penanganan kasus secara adil dan aman.</w:t>
+            </w:r>
+          </w:p>
+        </w:tc>
+      </w:tr>
+    </w:tbl>
+    <w:p>
+      <w:pPr>
+        <w:spacing w:before="0" w:after="120"/>
+      </w:pPr>
+    </w:p>
+    <w:p>
+      <w:r>
+        <w:br w:type="page"/>
+      </w:r>
+    </w:p>
+    <w:p>
+      <w:pPr>
+        <w:pStyle w:val="Heading1"/>
+        <w:spacing w:before="460" w:after="180"/>
+        <w:pBdr>
+          <w:bottom w:val="single" w:sz="18" w:space="6" w:color="059669"/>
+        </w:pBdr>
+        <w:keepNext/>
+      </w:pPr>
+      <w:r>
+        <w:rPr>
+          <w:rFonts w:ascii="Plus Jakarta Sans" w:hAnsi="Plus Jakarta Sans"/>
+          <w:b/>
+          <w:sz w:val="34"/>
+          <w:color w:val="065F46"/>
+        </w:rPr>
+        <w:t>Bab 4: Panduan Siswa Pembelajar (Siswa)</w:t>
+      </w:r>
+    </w:p>
+    <w:p>
+      <w:pPr>
+        <w:spacing w:before="0" w:after="120" w:line="280" w:lineRule="auto"/>
+      </w:pPr>
+      <w:r>
+        <w:rPr>
+          <w:color w:val="334155"/>
+          <w:sz w:val="22"/>
+        </w:rPr>
+        <w:t xml:space="preserve">Antarmuka siswa dirancang dengan pendekatan humanis, bebas dari elemen visual yang membingungkan, dan berfokus pada pengalaman belajar yang menyenangkan.</w:t>
+      </w:r>
+    </w:p>
+    <w:p>
+      <w:pPr>
+        <w:pStyle w:val="Heading2"/>
+        <w:spacing w:before="320" w:after="140"/>
+        <w:keepNext/>
+      </w:pPr>
+      <w:r>
+        <w:rPr>
+          <w:rFonts w:ascii="Plus Jakarta Sans" w:hAnsi="Plus Jakarta Sans"/>
+          <w:b/>
+          <w:sz w:val="28"/>
+          <w:color w:val="1E3A8A"/>
+        </w:rPr>
+        <w:t>4.1 Dasbor Pembelajaran &amp; Satu Aksi Utama</w:t>
       </w:r>
     </w:p>
     <w:p>
@@ -2510,7 +4853,7 @@
           <w:color w:val="334155"/>
           <w:sz w:val="22"/>
         </w:rPr>
-        <w:t xml:space="preserve">Menampilkan materi terakhir yang sedang dipelajari lengkap dengan persentase kelulusan.</w:t>
+        <w:t xml:space="preserve">Menampilkan materi terakhir yang sedang dipelajari (misal: "Mengenai BKKBN" atau "Apa sih SSK?") lengkap dengan persentase kelulusan.</w:t>
       </w:r>
     </w:p>
     <w:p>
@@ -2588,9 +4931,9 @@
             </wp:cNvGraphicFramePr>
             <a:graphic>
               <a:graphicData uri="http://schemas.openxmlformats.org/drawingml/2006/picture">
-                <pic:pic>
+                <pic:pic xmlns:pic="http://schemas.openxmlformats.org/drawingml/2006/picture">
                   <pic:nvPicPr>
-                    <pic:cNvPr id="4" name="Gambar 4"/>
+                    <pic:cNvPr id="4" name="Screenshot 4"/>
                     <pic:cNvPicPr/>
                   </pic:nvPicPr>
                   <pic:blipFill>
@@ -2607,11 +4950,6 @@
                     <a:prstGeom prst="rect">
                       <a:avLst/>
                     </a:prstGeom>
-                    <a:ln w="12700">
-                      <a:solidFill>
-                        <a:srgbClr val="CBD5E1"/>
-                      </a:solidFill>
-                    </a:ln>
                   </pic:spPr>
                 </pic:pic>
               </a:graphicData>
@@ -2631,7 +4969,7 @@
           <w:color w:val="64748B"/>
           <w:sz w:val="19"/>
         </w:rPr>
-        <w:t>Gambar 3.1: Dasbor Pembelajaran Siswa dengan kartu aksi primer "Lanjutkan Video Terakhir", indikator kelulusan bersahabat, dan filter topik materi.</w:t>
+        <w:t>Gambar 4.1: Dasbor Pembelajaran Siswa dengan kartu aksi primer "Lanjutkan Video Terakhir", indikator kelulusan bersahabat, dan filter topik materi.</w:t>
       </w:r>
     </w:p>
     <w:p>
@@ -2647,7 +4985,7 @@
           <w:sz w:val="28"/>
           <w:color w:val="1E3A8A"/>
         </w:rPr>
-        <w:t>3.2 Teater Belajar &amp; Pemutar Video HD (Classroom)</w:t>
+        <w:t>4.2 Teater Belajar &amp; Pemutar Video HD (Classroom)</w:t>
       </w:r>
     </w:p>
     <w:p>
@@ -2717,7 +5055,7 @@
           <w:color w:val="334155"/>
           <w:sz w:val="22"/>
         </w:rPr>
-        <w:t xml:space="preserve">Sistem secara otomatis menghitung durasi tontonan setiap 10 detik. Siswa wajib menonton minimal 90% durasi video sebelum status pelajaran tuntas dan tombol kuis terbuka.</w:t>
+        <w:t xml:space="preserve">Sistem secara otomatis menghitung durasi tontonan setiap 10 detik. Sebagai contoh, pada video Pelajaran 1.1 "Makna &amp; Filosofi Kelembagaan BKKBN" berdurasi 08:00 (480 detik), siswa wajib menonton minimal 07:12 (432 detik) sebelum status pelajaran tuntas dan tombol kuis terbuka.</w:t>
       </w:r>
     </w:p>
     <w:p>
@@ -2766,9 +5104,9 @@
             </wp:cNvGraphicFramePr>
             <a:graphic>
               <a:graphicData uri="http://schemas.openxmlformats.org/drawingml/2006/picture">
-                <pic:pic>
+                <pic:pic xmlns:pic="http://schemas.openxmlformats.org/drawingml/2006/picture">
                   <pic:nvPicPr>
-                    <pic:cNvPr id="5" name="Gambar 5"/>
+                    <pic:cNvPr id="5" name="Screenshot 5"/>
                     <pic:cNvPicPr/>
                   </pic:nvPicPr>
                   <pic:blipFill>
@@ -2785,11 +5123,6 @@
                     <a:prstGeom prst="rect">
                       <a:avLst/>
                     </a:prstGeom>
-                    <a:ln w="12700">
-                      <a:solidFill>
-                        <a:srgbClr val="CBD5E1"/>
-                      </a:solidFill>
-                    </a:ln>
                   </pic:spPr>
                 </pic:pic>
               </a:graphicData>
@@ -2809,7 +5142,7 @@
           <w:color w:val="64748B"/>
           <w:sz w:val="19"/>
         </w:rPr>
-        <w:t>Gambar 3.2: Ruang Belajar Digital (Classroom) dengan teater video YouTube HD bebas iklan, pelacak otomatis durasi tontonan 90%, dan tab navigasi interaktif.</w:t>
+        <w:t>Gambar 4.2: Ruang Belajar Digital (Classroom) dengan teater video YouTube HD bebas iklan, pelacak otomatis durasi tontonan 90%, dan tab navigasi interaktif.</w:t>
       </w:r>
     </w:p>
     <w:p>
@@ -2825,7 +5158,7 @@
           <w:sz w:val="28"/>
           <w:color w:val="1E3A8A"/>
         </w:rPr>
-        <w:t>3.3 Catatan Waktu Interaktif (Timestamp Notes)</w:t>
+        <w:t>4.3 Catatan Waktu Interaktif (Timestamp Notes)</w:t>
       </w:r>
     </w:p>
     <w:p>
@@ -2944,9 +5277,9 @@
             </wp:cNvGraphicFramePr>
             <a:graphic>
               <a:graphicData uri="http://schemas.openxmlformats.org/drawingml/2006/picture">
-                <pic:pic>
+                <pic:pic xmlns:pic="http://schemas.openxmlformats.org/drawingml/2006/picture">
                   <pic:nvPicPr>
-                    <pic:cNvPr id="6" name="Gambar 6"/>
+                    <pic:cNvPr id="6" name="Screenshot 6"/>
                     <pic:cNvPicPr/>
                   </pic:nvPicPr>
                   <pic:blipFill>
@@ -2963,11 +5296,6 @@
                     <a:prstGeom prst="rect">
                       <a:avLst/>
                     </a:prstGeom>
-                    <a:ln w="12700">
-                      <a:solidFill>
-                        <a:srgbClr val="CBD5E1"/>
-                      </a:solidFill>
-                    </a:ln>
                   </pic:spPr>
                 </pic:pic>
               </a:graphicData>
@@ -2987,7 +5315,7 @@
           <w:color w:val="64748B"/>
           <w:sz w:val="19"/>
         </w:rPr>
-        <w:t>Gambar 3.3: Panel Catatan Waktu Interaktif dengan tombol ambil menit video otomatis, pintasan simpan cepat, dan tag putar ulang (seekTo).</w:t>
+        <w:t>Gambar 4.3: Panel Catatan Waktu Interaktif dengan tombol ambil menit video otomatis, pintasan simpan cepat, dan tag putar ulang (seekTo).</w:t>
       </w:r>
     </w:p>
     <w:p>
@@ -3003,7 +5331,7 @@
           <w:sz w:val="28"/>
           <w:color w:val="1E3A8A"/>
         </w:rPr>
-        <w:t>3.4 Kuis Checkpoint &amp; Toleransi Kelulusan 70%</w:t>
+        <w:t>4.4 Kuis Checkpoint &amp; Toleransi Kelulusan 70%</w:t>
       </w:r>
     </w:p>
     <w:p>
@@ -3122,9 +5450,9 @@
             </wp:cNvGraphicFramePr>
             <a:graphic>
               <a:graphicData uri="http://schemas.openxmlformats.org/drawingml/2006/picture">
-                <pic:pic>
+                <pic:pic xmlns:pic="http://schemas.openxmlformats.org/drawingml/2006/picture">
                   <pic:nvPicPr>
-                    <pic:cNvPr id="7" name="Gambar 7"/>
+                    <pic:cNvPr id="7" name="Screenshot 7"/>
                     <pic:cNvPicPr/>
                   </pic:nvPicPr>
                   <pic:blipFill>
@@ -3141,11 +5469,6 @@
                     <a:prstGeom prst="rect">
                       <a:avLst/>
                     </a:prstGeom>
-                    <a:ln w="12700">
-                      <a:solidFill>
-                        <a:srgbClr val="CBD5E1"/>
-                      </a:solidFill>
-                    </a:ln>
                   </pic:spPr>
                 </pic:pic>
               </a:graphicData>
@@ -3165,7 +5488,7 @@
           <w:color w:val="64748B"/>
           <w:sz w:val="19"/>
         </w:rPr>
-        <w:t>Gambar 3.4: Tampilan kuis checkpoint dengan kartu opsi sentuh luas, umpan balik ramah jika nilai &lt; 70%, dan tombol instan ulangi kuis.</w:t>
+        <w:t>Gambar 4.4: Tampilan kuis checkpoint dengan kartu opsi sentuh luas, umpan balik ramah jika nilai &lt; 70%, dan tombol instan ulangi kuis.</w:t>
       </w:r>
     </w:p>
     <w:p>
@@ -3189,7 +5512,7 @@
           <w:sz w:val="34"/>
           <w:color w:val="065F46"/>
         </w:rPr>
-        <w:t>Bab 4: Panduan Guru / Pendidik (Guru)</w:t>
+        <w:t>Bab 5: Panduan Guru / Pendidik (Guru)</w:t>
       </w:r>
     </w:p>
     <w:p>
@@ -3201,7 +5524,7 @@
           <w:color w:val="334155"/>
           <w:sz w:val="22"/>
         </w:rPr>
-        <w:t xml:space="preserve">Akun Guru difasilitasi dengan alat penyusunan kurikulum yang modern, memudahkan pengunggahan materi berbasis video YouTube, serta pembuatan bank soal evaluasi.</w:t>
+        <w:t xml:space="preserve">Akun Guru (seperti Ibu Martha Runtuwene, S.Pd di SRMA 44 Minahasa dan Drs. Ronald Lumempouw di SMPN 1 Bitung) difasilitasi dengan alat penyusunan kurikulum yang modern, memudahkan pengunggahan materi berbasis video YouTube, serta pembuatan bank soal evaluasi.</w:t>
       </w:r>
     </w:p>
     <w:p>
@@ -3217,7 +5540,7 @@
           <w:sz w:val="28"/>
           <w:color w:val="1E3A8A"/>
         </w:rPr>
-        <w:t>4.1 Alur Kerja Unified Course Builder</w:t>
+        <w:t>5.1 Alur Kerja Unified Course Builder</w:t>
       </w:r>
     </w:p>
     <w:p>
@@ -3287,7 +5610,7 @@
           <w:color w:val="334155"/>
           <w:sz w:val="22"/>
         </w:rPr>
-        <w:t xml:space="preserve">Buat nama modul bab, tambahkan pelajaran, dan tempelkan tautan URL YouTube. Sistem secara otomatis mengekstrak durasi detik dan thumbnail video berkualitas tinggi.</w:t>
+        <w:t xml:space="preserve">Buat nama modul bab, tambahkan pelajaran, dan tempelkan tautan URL YouTube (seperti https://www.youtube.com/watch?v=6bGlT6CVohg). Sistem secara otomatis mengekstrak durasi detik dan thumbnail video berkualitas tinggi.</w:t>
       </w:r>
     </w:p>
     <w:p>
@@ -3365,9 +5688,9 @@
             </wp:cNvGraphicFramePr>
             <a:graphic>
               <a:graphicData uri="http://schemas.openxmlformats.org/drawingml/2006/picture">
-                <pic:pic>
+                <pic:pic xmlns:pic="http://schemas.openxmlformats.org/drawingml/2006/picture">
                   <pic:nvPicPr>
-                    <pic:cNvPr id="10" name="Gambar 10"/>
+                    <pic:cNvPr id="10" name="Screenshot 10"/>
                     <pic:cNvPicPr/>
                   </pic:nvPicPr>
                   <pic:blipFill>
@@ -3384,11 +5707,6 @@
                     <a:prstGeom prst="rect">
                       <a:avLst/>
                     </a:prstGeom>
-                    <a:ln w="12700">
-                      <a:solidFill>
-                        <a:srgbClr val="CBD5E1"/>
-                      </a:solidFill>
-                    </a:ln>
                   </pic:spPr>
                 </pic:pic>
               </a:graphicData>
@@ -3408,7 +5726,7 @@
           <w:color w:val="64748B"/>
           <w:sz w:val="19"/>
         </w:rPr>
-        <w:t>Gambar 4.1: Antarmuka Manajer Kursus untuk menyusun materi ajar, mengatur silabus bab, dan mengontrol visibilitas publik/tamu.</w:t>
+        <w:t>Gambar 5.1: Antarmuka Manajer Kursus untuk menyusun materi ajar, mengatur silabus bab, dan mengontrol visibilitas publik/tamu.</w:t>
       </w:r>
     </w:p>
     <w:p>
@@ -3432,7 +5750,7 @@
           <w:sz w:val="34"/>
           <w:color w:val="065F46"/>
         </w:rPr>
-        <w:t>Bab 5: Panduan Operator Sekolah (Operator)</w:t>
+        <w:t>Bab 6: Panduan Operator Sekolah (Operator)</w:t>
       </w:r>
     </w:p>
     <w:p>
@@ -3444,7 +5762,7 @@
           <w:color w:val="334155"/>
           <w:sz w:val="22"/>
         </w:rPr>
-        <w:t xml:space="preserve">Operator Sekolah bertanggung jawab atas administrasi peserta didik pada masing-masing satuan pendidikan.</w:t>
+        <w:t xml:space="preserve">Operator Sekolah (seperti Meivy Karundeng, S.Kom di SMP Negeri 1 Bitung) bertanggung jawab atas administrasi peserta didik pada masing-masing satuan pendidikan.</w:t>
       </w:r>
     </w:p>
     <w:p>
@@ -3460,7 +5778,7 @@
           <w:sz w:val="28"/>
           <w:color w:val="1E3A8A"/>
         </w:rPr>
-        <w:t>5.1 Pendaftaran Siswa Manual &amp; Impor Masal CSV</w:t>
+        <w:t>6.1 Pendaftaran Siswa Manual &amp; Impor Masal CSV</w:t>
       </w:r>
     </w:p>
     <w:p>
@@ -3546,7 +5864,7 @@
           <w:sz w:val="28"/>
           <w:color w:val="1E3A8A"/>
         </w:rPr>
-        <w:t>5.2 Pengaturan Ulang (Reset) Kata Sandi Akun Siswa</w:t>
+        <w:t>6.2 Pengaturan Ulang (Reset) Kata Sandi Akun Siswa</w:t>
       </w:r>
     </w:p>
     <w:p>
@@ -3607,9 +5925,9 @@
             </wp:cNvGraphicFramePr>
             <a:graphic>
               <a:graphicData uri="http://schemas.openxmlformats.org/drawingml/2006/picture">
-                <pic:pic>
+                <pic:pic xmlns:pic="http://schemas.openxmlformats.org/drawingml/2006/picture">
                   <pic:nvPicPr>
-                    <pic:cNvPr id="11" name="Gambar 11"/>
+                    <pic:cNvPr id="11" name="Screenshot 11"/>
                     <pic:cNvPicPr/>
                   </pic:nvPicPr>
                   <pic:blipFill>
@@ -3626,11 +5944,6 @@
                     <a:prstGeom prst="rect">
                       <a:avLst/>
                     </a:prstGeom>
-                    <a:ln w="12700">
-                      <a:solidFill>
-                        <a:srgbClr val="CBD5E1"/>
-                      </a:solidFill>
-                    </a:ln>
                   </pic:spPr>
                 </pic:pic>
               </a:graphicData>
@@ -3650,7 +5963,7 @@
           <w:color w:val="64748B"/>
           <w:sz w:val="19"/>
         </w:rPr>
-        <w:t>Gambar 5.1: Panel Manajemen Siswa Sekolah untuk penambahan akun satuan, impor masal CSV, dan pengaturan ulang (reset) kata sandi.</w:t>
+        <w:t>Gambar 6.1: Panel Manajemen Siswa Sekolah untuk penambahan akun satuan, impor masal CSV, dan pengaturan ulang (reset) kata sandi.</w:t>
       </w:r>
     </w:p>
     <w:p>
@@ -3674,7 +5987,7 @@
           <w:sz w:val="34"/>
           <w:color w:val="065F46"/>
         </w:rPr>
-        <w:t>Bab 6: Panduan Admin Pusat (Admin Pusat)</w:t>
+        <w:t>Bab 7: Panduan Admin Pusat (Admin Pusat)</w:t>
       </w:r>
     </w:p>
     <w:p>
@@ -3686,7 +5999,7 @@
           <w:color w:val="334155"/>
           <w:sz w:val="22"/>
         </w:rPr>
-        <w:t xml:space="preserve">Admin Pusat memiliki kendali tertinggi atas tata kelola ekosistem SIAGA BUMI-SSK se-Provinsi Sulawesi Utara.</w:t>
+        <w:t xml:space="preserve">Admin Pusat (seperti Dr. Hendra Sompotan, M.Si) memiliki kendali tertinggi atas tata kelola ekosistem SIAGA BUMI-SSK se-Provinsi Sulawesi Utara.</w:t>
       </w:r>
     </w:p>
     <w:p>
@@ -3702,7 +6015,7 @@
           <w:sz w:val="28"/>
           <w:color w:val="1E3A8A"/>
         </w:rPr>
-        <w:t>6.1 Dasbor Analitik Tingkat Provinsi</w:t>
+        <w:t>7.1 Dasbor Analitik Tingkat Provinsi</w:t>
       </w:r>
     </w:p>
     <w:p>
@@ -3734,9 +6047,9 @@
             </wp:cNvGraphicFramePr>
             <a:graphic>
               <a:graphicData uri="http://schemas.openxmlformats.org/drawingml/2006/picture">
-                <pic:pic>
+                <pic:pic xmlns:pic="http://schemas.openxmlformats.org/drawingml/2006/picture">
                   <pic:nvPicPr>
-                    <pic:cNvPr id="9" name="Gambar 9"/>
+                    <pic:cNvPr id="9" name="Screenshot 9"/>
                     <pic:cNvPicPr/>
                   </pic:nvPicPr>
                   <pic:blipFill>
@@ -3753,11 +6066,6 @@
                     <a:prstGeom prst="rect">
                       <a:avLst/>
                     </a:prstGeom>
-                    <a:ln w="12700">
-                      <a:solidFill>
-                        <a:srgbClr val="CBD5E1"/>
-                      </a:solidFill>
-                    </a:ln>
                   </pic:spPr>
                 </pic:pic>
               </a:graphicData>
@@ -3777,7 +6085,7 @@
           <w:color w:val="64748B"/>
           <w:sz w:val="19"/>
         </w:rPr>
-        <w:t>Gambar 6.1: Dasbor Analitik Administrator Pusat BKKBN Perwakilan Sulawesi Utara untuk pemantauan data makro sekolah dan kurikulum provinsi.</w:t>
+        <w:t>Gambar 7.1: Dasbor Analitik Administrator Pusat BKKBN Perwakilan Sulawesi Utara untuk pemantauan data makro sekolah dan kurikulum provinsi.</w:t>
       </w:r>
     </w:p>
     <w:p>
@@ -3793,7 +6101,7 @@
           <w:sz w:val="28"/>
           <w:color w:val="1E3A8A"/>
         </w:rPr>
-        <w:t>6.2 Fitur Kurasi Mode Galeri Tamu (is_visible_to_guest)</w:t>
+        <w:t>7.2 Fitur Kurasi Mode Galeri Tamu (is_visible_to_guest)</w:t>
       </w:r>
     </w:p>
     <w:p>
@@ -3834,7 +6142,7 @@
           <w:color w:val="334155"/>
           <w:sz w:val="22"/>
         </w:rPr>
-        <w:t xml:space="preserve">Materi dapat dilihat dan dipelajari oleh peran Penyuluh / Tamu di katalog mode galeri.</w:t>
+        <w:t xml:space="preserve">Disetel tampil di galeri publik sehingga penyuluh lapangan dan tamu dapat menyimak materi.</w:t>
       </w:r>
     </w:p>
     <w:p>
@@ -3863,7 +6171,7 @@
           <w:color w:val="334155"/>
           <w:sz w:val="22"/>
         </w:rPr>
-        <w:t xml:space="preserve">Materi bersifat tertutup dan hanya dapat diakses oleh siswa internal sekolah mitra.</w:t>
+        <w:t xml:space="preserve">Disetel tertutup untuk kurikulum internal sekolah binaan SRMA 44 Minahasa.</w:t>
       </w:r>
     </w:p>
     <w:p>
@@ -3887,7 +6195,7 @@
           <w:sz w:val="34"/>
           <w:color w:val="065F46"/>
         </w:rPr>
-        <w:t>Bab 7: Panduan Penyuluh &amp; Tamu (Mode Galeri)</w:t>
+        <w:t>Bab 8: Panduan Penyuluh &amp; Tamu (Mode Galeri)</w:t>
       </w:r>
     </w:p>
     <w:p>
@@ -3915,7 +6223,7 @@
           <w:sz w:val="28"/>
           <w:color w:val="1E3A8A"/>
         </w:rPr>
-        <w:t>7.1 Karakteristik Mode Galeri (View-Only)</w:t>
+        <w:t>8.1 Karakteristik Mode Galeri (View-Only)</w:t>
       </w:r>
     </w:p>
     <w:p>
@@ -4038,7 +6346,7 @@
           <w:sz w:val="34"/>
           <w:color w:val="065F46"/>
         </w:rPr>
-        <w:t>Bab 8: Sistem Sertifikasi Digital &amp; Verifikasi QR Code</w:t>
+        <w:t>Bab 9: Sistem Sertifikasi Digital &amp; Verifikasi QR Code</w:t>
       </w:r>
     </w:p>
     <w:p>
@@ -4066,7 +6374,7 @@
           <w:sz w:val="28"/>
           <w:color w:val="1E3A8A"/>
         </w:rPr>
-        <w:t>8.1 Tiga Syarat Mutlak Penerbitan Sertifikat</w:t>
+        <w:t>9.1 Tiga Syarat Mutlak Penerbitan Sertifikat</w:t>
       </w:r>
     </w:p>
     <w:p>
@@ -4152,7 +6460,7 @@
           <w:sz w:val="28"/>
           <w:color w:val="1E3A8A"/>
         </w:rPr>
-        <w:t>8.2 Laman Verifikasi Publik Ber-QR Code (/sertifikat/{kode})</w:t>
+        <w:t>9.2 Laman Verifikasi Publik Ber-QR Code (/sertifikat/{kode})</w:t>
       </w:r>
     </w:p>
     <w:p>
@@ -4164,7 +6472,7 @@
           <w:color w:val="334155"/>
           <w:sz w:val="22"/>
         </w:rPr>
-        <w:t xml:space="preserve">Setiap lembar sertifikat memiliki QR Code dinamis dan nomor seri unik terstandarisasi (contoh: CERT-SSK-BUDI-5BAC414B):</w:t>
+        <w:t xml:space="preserve">Setiap lembar sertifikat memiliki QR Code dinamis dan nomor seri unik terstandarisasi (contoh riil di database: CERT-SSK-BUDI-5BAC414B untuk siswa Budi Pratama dan CERT-SSK-SARAH-A1350F47 untuk siswi Sarah Connor):</w:t>
       </w:r>
     </w:p>
     <w:p>
@@ -4242,9 +6550,9 @@
             </wp:cNvGraphicFramePr>
             <a:graphic>
               <a:graphicData uri="http://schemas.openxmlformats.org/drawingml/2006/picture">
-                <pic:pic>
+                <pic:pic xmlns:pic="http://schemas.openxmlformats.org/drawingml/2006/picture">
                   <pic:nvPicPr>
-                    <pic:cNvPr id="8" name="Gambar 8"/>
+                    <pic:cNvPr id="8" name="Screenshot 8"/>
                     <pic:cNvPicPr/>
                   </pic:nvPicPr>
                   <pic:blipFill>
@@ -4261,11 +6569,6 @@
                     <a:prstGeom prst="rect">
                       <a:avLst/>
                     </a:prstGeom>
-                    <a:ln w="12700">
-                      <a:solidFill>
-                        <a:srgbClr val="CBD5E1"/>
-                      </a:solidFill>
-                    </a:ln>
                   </pic:spPr>
                 </pic:pic>
               </a:graphicData>
@@ -4285,7 +6588,7 @@
           <w:color w:val="64748B"/>
           <w:sz w:val="19"/>
         </w:rPr>
-        <w:t>Gambar 8.1: Laman Verifikasi Publik Resmi ber-QR Code yang dapat diakses oleh publik dan perguruan tinggi tanpa memerlukan otentikasi login.</w:t>
+        <w:t>Gambar 9.1: Laman Verifikasi Publik Resmi ber-QR Code yang dapat diakses oleh publik dan perguruan tinggi tanpa memerlukan otentikasi login.</w:t>
       </w:r>
     </w:p>
     <w:p>
@@ -4309,7 +6612,7 @@
           <w:sz w:val="34"/>
           <w:color w:val="065F46"/>
         </w:rPr>
-        <w:t>Bab 9: Tanya Jawab Umum &amp; Solusi Kendala Teknis (FAQ)</w:t>
+        <w:t>Bab 10: Tanya Jawab Umum &amp; Solusi Kendala Teknis (FAQ)</w:t>
       </w:r>
     </w:p>
     <w:p>
@@ -4337,7 +6640,7 @@
           <w:sz w:val="28"/>
           <w:color w:val="1E3A8A"/>
         </w:rPr>
-        <w:t>9.1 Mengapa Tombol Kuis Checkpoint Belum Bisa Dibuka?</w:t>
+        <w:t>10.1 Mengapa Tombol Kuis Checkpoint Belum Bisa Dibuka?</w:t>
       </w:r>
     </w:p>
     <w:p>
@@ -4365,7 +6668,7 @@
           <w:sz w:val="28"/>
           <w:color w:val="1E3A8A"/>
         </w:rPr>
-        <w:t>9.2 Apa yang Harus Dilakukan Jika Nilai Kuis di Bawah 70%?</w:t>
+        <w:t>10.2 Apa yang Harus Dilakukan Jika Nilai Kuis di Bawah 70%?</w:t>
       </w:r>
     </w:p>
     <w:p>
@@ -4393,7 +6696,7 @@
           <w:sz w:val="28"/>
           <w:color w:val="1E3A8A"/>
         </w:rPr>
-        <w:t>9.3 Mengapa Video YouTube Menampilkan Tulisan "Video Unavailable"?</w:t>
+        <w:t>10.3 Mengapa Video YouTube Menampilkan Tulisan "Video Unavailable"?</w:t>
       </w:r>
     </w:p>
     <w:p>
@@ -4421,7 +6724,7 @@
           <w:sz w:val="28"/>
           <w:color w:val="1E3A8A"/>
         </w:rPr>
-        <w:t>9.4 Bagaimana Cara Membetulkan Salah Eja Nama pada Lembar Sertifikat?</w:t>
+        <w:t>10.4 Bagaimana Cara Membetulkan Salah Eja Nama pada Lembar Sertifikat?</w:t>
       </w:r>
     </w:p>
     <w:p>
@@ -4449,7 +6752,7 @@
           <w:sz w:val="28"/>
           <w:color w:val="1E3A8A"/>
         </w:rPr>
-        <w:t>9.5 Apakah Aplikasi Dapat Diakses di Smartphone?</w:t>
+        <w:t>10.5 Apakah Aplikasi Dapat Diakses di Smartphone?</w:t>
       </w:r>
     </w:p>
     <w:p>
@@ -4519,22 +6822,10 @@
       <w:color w:val="0F172A"/>
     </w:rPr>
   </w:style>
-  <w:style w:type="paragraph" w:styleId="Subtitle">
-    <w:name w:val="Subtitle"/>
-    <w:pPr>
-      <w:jc w:val="center"/>
-      <w:spacing w:before="0" w:after="400"/>
-    </w:pPr>
-    <w:rPr>
-      <w:rFonts w:ascii="Plus Jakarta Sans" w:hAnsi="Plus Jakarta Sans"/>
-      <w:sz w:val="26"/>
-      <w:color w:val="059669"/>
-    </w:rPr>
-  </w:style>
   <w:style w:type="paragraph" w:styleId="Heading1">
     <w:name w:val="heading 1"/>
     <w:pPr>
-      <w:spacing w:before="440" w:after="180"/>
+      <w:spacing w:before="440" w:after="160"/>
       <w:keepNext/>
     </w:pPr>
     <w:rPr>
@@ -4547,7 +6838,7 @@
   <w:style w:type="paragraph" w:styleId="Heading2">
     <w:name w:val="heading 2"/>
     <w:pPr>
-      <w:spacing w:before="320" w:after="140"/>
+      <w:spacing w:before="320" w:after="120"/>
       <w:keepNext/>
     </w:pPr>
     <w:rPr>

</xml_diff>